<commit_message>
Third commit on 13-02-2026\
</commit_message>
<xml_diff>
--- a/Unit-I/Notes/Unit_I_Notes.docx
+++ b/Unit-I/Notes/Unit_I_Notes.docx
@@ -45,25 +45,7 @@
           <w:sz w:val="24"/>
           <w:szCs w:val="24"/>
         </w:rPr>
-        <w:t xml:space="preserve">Imagine you write a letter in English, but the person who receives it understands only Hindi. </w:t>
-      </w:r>
-      <w:proofErr w:type="gramStart"/>
-      <w:r>
-        <w:rPr>
-          <w:rFonts w:ascii="Times New Roman" w:hAnsi="Times New Roman" w:cs="Times New Roman"/>
-          <w:sz w:val="24"/>
-          <w:szCs w:val="24"/>
-        </w:rPr>
-        <w:t>So</w:t>
-      </w:r>
-      <w:proofErr w:type="gramEnd"/>
-      <w:r>
-        <w:rPr>
-          <w:rFonts w:ascii="Times New Roman" w:hAnsi="Times New Roman" w:cs="Times New Roman"/>
-          <w:sz w:val="24"/>
-          <w:szCs w:val="24"/>
-        </w:rPr>
-        <w:t xml:space="preserve"> you need a translator in between.</w:t>
+        <w:t>Imagine you write a letter in English, but the person who receives it understands only Hindi. So you need a translator in between.</w:t>
       </w:r>
     </w:p>
     <w:p>
@@ -125,23 +107,13 @@
           <w:szCs w:val="24"/>
         </w:rPr>
       </w:pPr>
-      <w:proofErr w:type="gramStart"/>
-      <w:r>
-        <w:rPr>
-          <w:rFonts w:ascii="Times New Roman" w:hAnsi="Times New Roman" w:cs="Times New Roman"/>
-          <w:sz w:val="24"/>
-          <w:szCs w:val="24"/>
-        </w:rPr>
-        <w:t>So</w:t>
-      </w:r>
-      <w:proofErr w:type="gramEnd"/>
-      <w:r>
-        <w:rPr>
-          <w:rFonts w:ascii="Times New Roman" w:hAnsi="Times New Roman" w:cs="Times New Roman"/>
-          <w:sz w:val="24"/>
-          <w:szCs w:val="24"/>
-        </w:rPr>
-        <w:t xml:space="preserve"> we need something in between that converts your program into machine language.</w:t>
+      <w:r>
+        <w:rPr>
+          <w:rFonts w:ascii="Times New Roman" w:hAnsi="Times New Roman" w:cs="Times New Roman"/>
+          <w:sz w:val="24"/>
+          <w:szCs w:val="24"/>
+        </w:rPr>
+        <w:t>So we need something in between that converts your program into machine language.</w:t>
       </w:r>
     </w:p>
     <w:p>
@@ -632,25 +604,7 @@
           <w:sz w:val="24"/>
           <w:szCs w:val="24"/>
         </w:rPr>
-        <w:t>Compiler (</w:t>
-      </w:r>
-      <w:proofErr w:type="spellStart"/>
-      <w:r>
-        <w:rPr>
-          <w:rFonts w:ascii="Times New Roman" w:hAnsi="Times New Roman" w:cs="Times New Roman"/>
-          <w:sz w:val="24"/>
-          <w:szCs w:val="24"/>
-        </w:rPr>
-        <w:t>javac</w:t>
-      </w:r>
-      <w:proofErr w:type="spellEnd"/>
-      <w:r>
-        <w:rPr>
-          <w:rFonts w:ascii="Times New Roman" w:hAnsi="Times New Roman" w:cs="Times New Roman"/>
-          <w:sz w:val="24"/>
-          <w:szCs w:val="24"/>
-        </w:rPr>
-        <w:t>)</w:t>
+        <w:t>Compiler (javac)</w:t>
       </w:r>
     </w:p>
     <w:p>
@@ -888,33 +842,15 @@
           <w:sz w:val="24"/>
           <w:szCs w:val="24"/>
         </w:rPr>
-        <w:t xml:space="preserve">Memory </w:t>
-      </w:r>
-      <w:proofErr w:type="gramStart"/>
-      <w:r>
-        <w:rPr>
-          <w:rFonts w:ascii="Times New Roman" w:hAnsi="Times New Roman" w:cs="Times New Roman"/>
-          <w:sz w:val="24"/>
-          <w:szCs w:val="24"/>
-        </w:rPr>
-        <w:t>Management</w:t>
-      </w:r>
-      <w:r>
-        <w:rPr>
-          <w:rFonts w:ascii="Times New Roman" w:hAnsi="Times New Roman" w:cs="Times New Roman"/>
-          <w:sz w:val="24"/>
-          <w:szCs w:val="24"/>
-        </w:rPr>
-        <w:t xml:space="preserve"> :</w:t>
-      </w:r>
-      <w:proofErr w:type="gramEnd"/>
-      <w:r>
-        <w:rPr>
-          <w:rFonts w:ascii="Times New Roman" w:hAnsi="Times New Roman" w:cs="Times New Roman"/>
-          <w:sz w:val="24"/>
-          <w:szCs w:val="24"/>
-        </w:rPr>
-        <w:t xml:space="preserve"> </w:t>
+        <w:t>Memory Management</w:t>
+      </w:r>
+      <w:r>
+        <w:rPr>
+          <w:rFonts w:ascii="Times New Roman" w:hAnsi="Times New Roman" w:cs="Times New Roman"/>
+          <w:sz w:val="24"/>
+          <w:szCs w:val="24"/>
+        </w:rPr>
+        <w:t xml:space="preserve"> : </w:t>
       </w:r>
       <w:r>
         <w:rPr>
@@ -2582,29 +2518,7 @@
           <w:sz w:val="24"/>
           <w:szCs w:val="24"/>
         </w:rPr>
-        <w:t>Compiler (</w:t>
-      </w:r>
-      <w:proofErr w:type="spellStart"/>
-      <w:r>
-        <w:rPr>
-          <w:rFonts w:ascii="Times New Roman" w:hAnsi="Times New Roman" w:cs="Times New Roman"/>
-          <w:b/>
-          <w:bCs/>
-          <w:sz w:val="24"/>
-          <w:szCs w:val="24"/>
-        </w:rPr>
-        <w:t>javac</w:t>
-      </w:r>
-      <w:proofErr w:type="spellEnd"/>
-      <w:r>
-        <w:rPr>
-          <w:rFonts w:ascii="Times New Roman" w:hAnsi="Times New Roman" w:cs="Times New Roman"/>
-          <w:b/>
-          <w:bCs/>
-          <w:sz w:val="24"/>
-          <w:szCs w:val="24"/>
-        </w:rPr>
-        <w:t>)</w:t>
+        <w:t>Compiler (javac)</w:t>
       </w:r>
     </w:p>
     <w:p>
@@ -3127,6 +3041,2279 @@
       <w:pPr>
         <w:rPr>
           <w:rFonts w:ascii="Times New Roman" w:hAnsi="Times New Roman" w:cs="Times New Roman"/>
+          <w:b/>
+          <w:bCs/>
+          <w:color w:val="EE0000"/>
+          <w:sz w:val="28"/>
+        </w:rPr>
+      </w:pPr>
+      <w:r>
+        <w:rPr>
+          <w:rFonts w:ascii="Times New Roman" w:hAnsi="Times New Roman" w:cs="Times New Roman"/>
+          <w:b/>
+          <w:bCs/>
+          <w:color w:val="EE0000"/>
+          <w:sz w:val="28"/>
+        </w:rPr>
+        <w:t xml:space="preserve">Q4 . </w:t>
+      </w:r>
+      <w:r>
+        <w:rPr>
+          <w:rFonts w:ascii="Times New Roman" w:hAnsi="Times New Roman" w:cs="Times New Roman"/>
+          <w:b/>
+          <w:bCs/>
+          <w:color w:val="EE0000"/>
+          <w:sz w:val="28"/>
+        </w:rPr>
+        <w:t>What is a Class?</w:t>
+      </w:r>
+    </w:p>
+    <w:p>
+      <w:pPr>
+        <w:rPr>
+          <w:rFonts w:ascii="Times New Roman" w:hAnsi="Times New Roman" w:cs="Times New Roman"/>
+          <w:sz w:val="24"/>
+          <w:szCs w:val="24"/>
+        </w:rPr>
+      </w:pPr>
+      <w:r>
+        <w:rPr>
+          <w:rFonts w:ascii="Times New Roman" w:hAnsi="Times New Roman" w:cs="Times New Roman"/>
+          <w:sz w:val="24"/>
+          <w:szCs w:val="24"/>
+        </w:rPr>
+        <w:t>Think very simple.</w:t>
+      </w:r>
+    </w:p>
+    <w:p>
+      <w:pPr>
+        <w:rPr>
+          <w:rFonts w:ascii="Times New Roman" w:hAnsi="Times New Roman" w:cs="Times New Roman"/>
+          <w:sz w:val="24"/>
+          <w:szCs w:val="24"/>
+        </w:rPr>
+      </w:pPr>
+      <w:r>
+        <w:rPr>
+          <w:rFonts w:ascii="Times New Roman" w:hAnsi="Times New Roman" w:cs="Times New Roman"/>
+          <w:sz w:val="24"/>
+          <w:szCs w:val="24"/>
+        </w:rPr>
+        <w:t xml:space="preserve">A </w:t>
+      </w:r>
+      <w:r>
+        <w:rPr>
+          <w:rFonts w:ascii="Times New Roman" w:hAnsi="Times New Roman" w:cs="Times New Roman"/>
+          <w:b/>
+          <w:bCs/>
+          <w:sz w:val="24"/>
+          <w:szCs w:val="24"/>
+        </w:rPr>
+        <w:t>class</w:t>
+      </w:r>
+      <w:r>
+        <w:rPr>
+          <w:rFonts w:ascii="Times New Roman" w:hAnsi="Times New Roman" w:cs="Times New Roman"/>
+          <w:sz w:val="24"/>
+          <w:szCs w:val="24"/>
+        </w:rPr>
+        <w:t xml:space="preserve"> is a </w:t>
+      </w:r>
+      <w:r>
+        <w:rPr>
+          <w:rFonts w:ascii="Times New Roman" w:hAnsi="Times New Roman" w:cs="Times New Roman"/>
+          <w:b/>
+          <w:bCs/>
+          <w:sz w:val="24"/>
+          <w:szCs w:val="24"/>
+        </w:rPr>
+        <w:t>blueprint (design)</w:t>
+      </w:r>
+      <w:r>
+        <w:rPr>
+          <w:rFonts w:ascii="Times New Roman" w:hAnsi="Times New Roman" w:cs="Times New Roman"/>
+          <w:sz w:val="24"/>
+          <w:szCs w:val="24"/>
+        </w:rPr>
+        <w:t>.</w:t>
+      </w:r>
+    </w:p>
+    <w:p>
+      <w:pPr>
+        <w:rPr>
+          <w:rFonts w:ascii="Times New Roman" w:hAnsi="Times New Roman" w:cs="Times New Roman"/>
+          <w:sz w:val="24"/>
+          <w:szCs w:val="24"/>
+        </w:rPr>
+      </w:pPr>
+      <w:r>
+        <w:rPr>
+          <w:rFonts w:ascii="Times New Roman" w:hAnsi="Times New Roman" w:cs="Times New Roman"/>
+          <w:sz w:val="24"/>
+          <w:szCs w:val="24"/>
+        </w:rPr>
+        <w:t>It tells:</w:t>
+      </w:r>
+    </w:p>
+    <w:p>
+      <w:pPr>
+        <w:numPr>
+          <w:ilvl w:val="0"/>
+          <w:numId w:val="13"/>
+        </w:numPr>
+        <w:rPr>
+          <w:rFonts w:ascii="Times New Roman" w:hAnsi="Times New Roman" w:cs="Times New Roman"/>
+          <w:sz w:val="24"/>
+          <w:szCs w:val="24"/>
+        </w:rPr>
+      </w:pPr>
+      <w:r>
+        <w:rPr>
+          <w:rFonts w:ascii="Times New Roman" w:hAnsi="Times New Roman" w:cs="Times New Roman"/>
+          <w:sz w:val="24"/>
+          <w:szCs w:val="24"/>
+        </w:rPr>
+        <w:t>What data something has</w:t>
+      </w:r>
+    </w:p>
+    <w:p>
+      <w:pPr>
+        <w:numPr>
+          <w:ilvl w:val="0"/>
+          <w:numId w:val="13"/>
+        </w:numPr>
+        <w:rPr>
+          <w:rFonts w:ascii="Times New Roman" w:hAnsi="Times New Roman" w:cs="Times New Roman"/>
+          <w:sz w:val="24"/>
+          <w:szCs w:val="24"/>
+        </w:rPr>
+      </w:pPr>
+      <w:r>
+        <w:rPr>
+          <w:rFonts w:ascii="Times New Roman" w:hAnsi="Times New Roman" w:cs="Times New Roman"/>
+          <w:sz w:val="24"/>
+          <w:szCs w:val="24"/>
+        </w:rPr>
+        <w:t>What actions it can perform</w:t>
+      </w:r>
+    </w:p>
+    <w:p>
+      <w:pPr>
+        <w:rPr>
+          <w:rFonts w:ascii="Times New Roman" w:hAnsi="Times New Roman" w:cs="Times New Roman"/>
+          <w:sz w:val="24"/>
+          <w:szCs w:val="24"/>
+        </w:rPr>
+      </w:pPr>
+      <w:r>
+        <w:rPr>
+          <w:rFonts w:ascii="Times New Roman" w:hAnsi="Times New Roman" w:cs="Times New Roman"/>
+          <w:sz w:val="24"/>
+          <w:szCs w:val="24"/>
+        </w:rPr>
+        <w:t xml:space="preserve">But class itself is </w:t>
+      </w:r>
+      <w:r>
+        <w:rPr>
+          <w:rFonts w:ascii="Times New Roman" w:hAnsi="Times New Roman" w:cs="Times New Roman"/>
+          <w:b/>
+          <w:bCs/>
+          <w:sz w:val="24"/>
+          <w:szCs w:val="24"/>
+        </w:rPr>
+        <w:t>not real</w:t>
+      </w:r>
+      <w:r>
+        <w:rPr>
+          <w:rFonts w:ascii="Times New Roman" w:hAnsi="Times New Roman" w:cs="Times New Roman"/>
+          <w:sz w:val="24"/>
+          <w:szCs w:val="24"/>
+        </w:rPr>
+        <w:t>.</w:t>
+      </w:r>
+      <w:r>
+        <w:rPr>
+          <w:rFonts w:ascii="Times New Roman" w:hAnsi="Times New Roman" w:cs="Times New Roman"/>
+          <w:sz w:val="24"/>
+          <w:szCs w:val="24"/>
+        </w:rPr>
+        <w:br/>
+        <w:t>It is only a design.</w:t>
+      </w:r>
+    </w:p>
+    <w:p>
+      <w:pPr>
+        <w:rPr>
+          <w:rFonts w:ascii="Times New Roman" w:hAnsi="Times New Roman" w:cs="Times New Roman"/>
+          <w:b/>
+          <w:bCs/>
+          <w:sz w:val="24"/>
+          <w:szCs w:val="24"/>
+        </w:rPr>
+      </w:pPr>
+      <w:r>
+        <w:rPr>
+          <w:rFonts w:ascii="Times New Roman" w:hAnsi="Times New Roman" w:cs="Times New Roman"/>
+          <w:b/>
+          <w:bCs/>
+          <w:sz w:val="24"/>
+          <w:szCs w:val="24"/>
+        </w:rPr>
+        <w:t>Simple Example 1 – Student Class</w:t>
+      </w:r>
+    </w:p>
+    <w:p>
+      <w:pPr>
+        <w:rPr>
+          <w:rFonts w:ascii="Times New Roman" w:hAnsi="Times New Roman" w:cs="Times New Roman"/>
+          <w:sz w:val="24"/>
+          <w:szCs w:val="24"/>
+        </w:rPr>
+      </w:pPr>
+      <w:r>
+        <w:rPr>
+          <w:rFonts w:ascii="Times New Roman" w:hAnsi="Times New Roman" w:cs="Times New Roman"/>
+          <w:sz w:val="24"/>
+          <w:szCs w:val="24"/>
+        </w:rPr>
+        <w:t>Suppose we want to describe a student.</w:t>
+      </w:r>
+    </w:p>
+    <w:p>
+      <w:pPr>
+        <w:rPr>
+          <w:rFonts w:ascii="Times New Roman" w:hAnsi="Times New Roman" w:cs="Times New Roman"/>
+          <w:sz w:val="24"/>
+          <w:szCs w:val="24"/>
+        </w:rPr>
+      </w:pPr>
+      <w:r>
+        <w:rPr>
+          <w:rFonts w:ascii="Times New Roman" w:hAnsi="Times New Roman" w:cs="Times New Roman"/>
+          <w:sz w:val="24"/>
+          <w:szCs w:val="24"/>
+        </w:rPr>
+        <w:t>Every student has:</w:t>
+      </w:r>
+    </w:p>
+    <w:p>
+      <w:pPr>
+        <w:numPr>
+          <w:ilvl w:val="0"/>
+          <w:numId w:val="14"/>
+        </w:numPr>
+        <w:rPr>
+          <w:rFonts w:ascii="Times New Roman" w:hAnsi="Times New Roman" w:cs="Times New Roman"/>
+          <w:sz w:val="24"/>
+          <w:szCs w:val="24"/>
+        </w:rPr>
+      </w:pPr>
+      <w:r>
+        <w:rPr>
+          <w:rFonts w:ascii="Times New Roman" w:hAnsi="Times New Roman" w:cs="Times New Roman"/>
+          <w:sz w:val="24"/>
+          <w:szCs w:val="24"/>
+        </w:rPr>
+        <w:t>name</w:t>
+      </w:r>
+    </w:p>
+    <w:p>
+      <w:pPr>
+        <w:numPr>
+          <w:ilvl w:val="0"/>
+          <w:numId w:val="14"/>
+        </w:numPr>
+        <w:rPr>
+          <w:rFonts w:ascii="Times New Roman" w:hAnsi="Times New Roman" w:cs="Times New Roman"/>
+          <w:sz w:val="24"/>
+          <w:szCs w:val="24"/>
+        </w:rPr>
+      </w:pPr>
+      <w:r>
+        <w:rPr>
+          <w:rFonts w:ascii="Times New Roman" w:hAnsi="Times New Roman" w:cs="Times New Roman"/>
+          <w:sz w:val="24"/>
+          <w:szCs w:val="24"/>
+        </w:rPr>
+        <w:t>roll number</w:t>
+      </w:r>
+    </w:p>
+    <w:p>
+      <w:pPr>
+        <w:numPr>
+          <w:ilvl w:val="0"/>
+          <w:numId w:val="14"/>
+        </w:numPr>
+        <w:rPr>
+          <w:rFonts w:ascii="Times New Roman" w:hAnsi="Times New Roman" w:cs="Times New Roman"/>
+          <w:sz w:val="24"/>
+          <w:szCs w:val="24"/>
+        </w:rPr>
+      </w:pPr>
+      <w:r>
+        <w:rPr>
+          <w:rFonts w:ascii="Times New Roman" w:hAnsi="Times New Roman" w:cs="Times New Roman"/>
+          <w:sz w:val="24"/>
+          <w:szCs w:val="24"/>
+        </w:rPr>
+        <w:t>marks</w:t>
+      </w:r>
+    </w:p>
+    <w:p>
+      <w:pPr>
+        <w:rPr>
+          <w:rFonts w:ascii="Times New Roman" w:hAnsi="Times New Roman" w:cs="Times New Roman"/>
+          <w:sz w:val="24"/>
+          <w:szCs w:val="24"/>
+        </w:rPr>
+      </w:pPr>
+      <w:r>
+        <w:rPr>
+          <w:rFonts w:ascii="Times New Roman" w:hAnsi="Times New Roman" w:cs="Times New Roman"/>
+          <w:sz w:val="24"/>
+          <w:szCs w:val="24"/>
+        </w:rPr>
+        <w:t>Every student can:</w:t>
+      </w:r>
+    </w:p>
+    <w:p>
+      <w:pPr>
+        <w:numPr>
+          <w:ilvl w:val="0"/>
+          <w:numId w:val="15"/>
+        </w:numPr>
+        <w:rPr>
+          <w:rFonts w:ascii="Times New Roman" w:hAnsi="Times New Roman" w:cs="Times New Roman"/>
+          <w:sz w:val="24"/>
+          <w:szCs w:val="24"/>
+        </w:rPr>
+      </w:pPr>
+      <w:r>
+        <w:rPr>
+          <w:rFonts w:ascii="Times New Roman" w:hAnsi="Times New Roman" w:cs="Times New Roman"/>
+          <w:sz w:val="24"/>
+          <w:szCs w:val="24"/>
+        </w:rPr>
+        <w:t>study</w:t>
+      </w:r>
+    </w:p>
+    <w:p>
+      <w:pPr>
+        <w:numPr>
+          <w:ilvl w:val="0"/>
+          <w:numId w:val="15"/>
+        </w:numPr>
+        <w:rPr>
+          <w:rFonts w:ascii="Times New Roman" w:hAnsi="Times New Roman" w:cs="Times New Roman"/>
+          <w:sz w:val="24"/>
+          <w:szCs w:val="24"/>
+        </w:rPr>
+      </w:pPr>
+      <w:r>
+        <w:rPr>
+          <w:rFonts w:ascii="Times New Roman" w:hAnsi="Times New Roman" w:cs="Times New Roman"/>
+          <w:sz w:val="24"/>
+          <w:szCs w:val="24"/>
+        </w:rPr>
+        <w:t>give exam</w:t>
+      </w:r>
+    </w:p>
+    <w:p>
+      <w:pPr>
+        <w:rPr>
+          <w:rFonts w:ascii="Times New Roman" w:hAnsi="Times New Roman" w:cs="Times New Roman"/>
+          <w:sz w:val="24"/>
+          <w:szCs w:val="24"/>
+        </w:rPr>
+      </w:pPr>
+      <w:r>
+        <w:rPr>
+          <w:rFonts w:ascii="Times New Roman" w:hAnsi="Times New Roman" w:cs="Times New Roman"/>
+          <w:sz w:val="24"/>
+          <w:szCs w:val="24"/>
+        </w:rPr>
+        <w:lastRenderedPageBreak/>
+        <w:t xml:space="preserve">So we create a </w:t>
+      </w:r>
+      <w:r>
+        <w:rPr>
+          <w:rFonts w:ascii="Times New Roman" w:hAnsi="Times New Roman" w:cs="Times New Roman"/>
+          <w:b/>
+          <w:bCs/>
+          <w:sz w:val="24"/>
+          <w:szCs w:val="24"/>
+        </w:rPr>
+        <w:t>Student class</w:t>
+      </w:r>
+      <w:r>
+        <w:rPr>
+          <w:rFonts w:ascii="Times New Roman" w:hAnsi="Times New Roman" w:cs="Times New Roman"/>
+          <w:sz w:val="24"/>
+          <w:szCs w:val="24"/>
+        </w:rPr>
+        <w:t xml:space="preserve"> that defines these things.</w:t>
+      </w:r>
+    </w:p>
+    <w:p>
+      <w:pPr>
+        <w:rPr>
+          <w:rFonts w:ascii="Times New Roman" w:hAnsi="Times New Roman" w:cs="Times New Roman"/>
+          <w:sz w:val="24"/>
+          <w:szCs w:val="24"/>
+        </w:rPr>
+      </w:pPr>
+      <w:r>
+        <w:rPr>
+          <w:rFonts w:ascii="Times New Roman" w:hAnsi="Times New Roman" w:cs="Times New Roman"/>
+          <w:sz w:val="24"/>
+          <w:szCs w:val="24"/>
+        </w:rPr>
+        <w:t>But remember:</w:t>
+      </w:r>
+    </w:p>
+    <w:p>
+      <w:pPr>
+        <w:rPr>
+          <w:rFonts w:ascii="Times New Roman" w:hAnsi="Times New Roman" w:cs="Times New Roman"/>
+          <w:sz w:val="24"/>
+          <w:szCs w:val="24"/>
+        </w:rPr>
+      </w:pPr>
+      <w:r>
+        <w:rPr>
+          <w:rFonts w:ascii="Times New Roman" w:hAnsi="Times New Roman" w:cs="Times New Roman"/>
+          <w:sz w:val="24"/>
+          <w:szCs w:val="24"/>
+        </w:rPr>
+        <w:t xml:space="preserve">Class is only a </w:t>
+      </w:r>
+      <w:r>
+        <w:rPr>
+          <w:rFonts w:ascii="Times New Roman" w:hAnsi="Times New Roman" w:cs="Times New Roman"/>
+          <w:b/>
+          <w:bCs/>
+          <w:sz w:val="24"/>
+          <w:szCs w:val="24"/>
+        </w:rPr>
+        <w:t>plan</w:t>
+      </w:r>
+      <w:r>
+        <w:rPr>
+          <w:rFonts w:ascii="Times New Roman" w:hAnsi="Times New Roman" w:cs="Times New Roman"/>
+          <w:sz w:val="24"/>
+          <w:szCs w:val="24"/>
+        </w:rPr>
+        <w:t>, not an actual student.</w:t>
+      </w:r>
+    </w:p>
+    <w:p>
+      <w:pPr>
+        <w:rPr>
+          <w:rFonts w:ascii="Times New Roman" w:hAnsi="Times New Roman" w:cs="Times New Roman"/>
+          <w:b/>
+          <w:bCs/>
+          <w:sz w:val="24"/>
+          <w:szCs w:val="24"/>
+        </w:rPr>
+      </w:pPr>
+      <w:r>
+        <w:rPr>
+          <w:rFonts w:ascii="Times New Roman" w:hAnsi="Times New Roman" w:cs="Times New Roman"/>
+          <w:b/>
+          <w:bCs/>
+          <w:sz w:val="24"/>
+          <w:szCs w:val="24"/>
+        </w:rPr>
+        <w:t>Simple Example 2 – Car Class</w:t>
+      </w:r>
+    </w:p>
+    <w:p>
+      <w:pPr>
+        <w:rPr>
+          <w:rFonts w:ascii="Times New Roman" w:hAnsi="Times New Roman" w:cs="Times New Roman"/>
+          <w:sz w:val="24"/>
+          <w:szCs w:val="24"/>
+        </w:rPr>
+      </w:pPr>
+      <w:r>
+        <w:rPr>
+          <w:rFonts w:ascii="Times New Roman" w:hAnsi="Times New Roman" w:cs="Times New Roman"/>
+          <w:sz w:val="24"/>
+          <w:szCs w:val="24"/>
+        </w:rPr>
+        <w:t>A car has:</w:t>
+      </w:r>
+    </w:p>
+    <w:p>
+      <w:pPr>
+        <w:numPr>
+          <w:ilvl w:val="0"/>
+          <w:numId w:val="16"/>
+        </w:numPr>
+        <w:rPr>
+          <w:rFonts w:ascii="Times New Roman" w:hAnsi="Times New Roman" w:cs="Times New Roman"/>
+          <w:sz w:val="24"/>
+          <w:szCs w:val="24"/>
+        </w:rPr>
+      </w:pPr>
+      <w:r>
+        <w:rPr>
+          <w:rFonts w:ascii="Times New Roman" w:hAnsi="Times New Roman" w:cs="Times New Roman"/>
+          <w:sz w:val="24"/>
+          <w:szCs w:val="24"/>
+        </w:rPr>
+        <w:t>color</w:t>
+      </w:r>
+    </w:p>
+    <w:p>
+      <w:pPr>
+        <w:numPr>
+          <w:ilvl w:val="0"/>
+          <w:numId w:val="16"/>
+        </w:numPr>
+        <w:rPr>
+          <w:rFonts w:ascii="Times New Roman" w:hAnsi="Times New Roman" w:cs="Times New Roman"/>
+          <w:sz w:val="24"/>
+          <w:szCs w:val="24"/>
+        </w:rPr>
+      </w:pPr>
+      <w:r>
+        <w:rPr>
+          <w:rFonts w:ascii="Times New Roman" w:hAnsi="Times New Roman" w:cs="Times New Roman"/>
+          <w:sz w:val="24"/>
+          <w:szCs w:val="24"/>
+        </w:rPr>
+        <w:t>speed</w:t>
+      </w:r>
+    </w:p>
+    <w:p>
+      <w:pPr>
+        <w:numPr>
+          <w:ilvl w:val="0"/>
+          <w:numId w:val="16"/>
+        </w:numPr>
+        <w:rPr>
+          <w:rFonts w:ascii="Times New Roman" w:hAnsi="Times New Roman" w:cs="Times New Roman"/>
+          <w:sz w:val="24"/>
+          <w:szCs w:val="24"/>
+        </w:rPr>
+      </w:pPr>
+      <w:r>
+        <w:rPr>
+          <w:rFonts w:ascii="Times New Roman" w:hAnsi="Times New Roman" w:cs="Times New Roman"/>
+          <w:sz w:val="24"/>
+          <w:szCs w:val="24"/>
+        </w:rPr>
+        <w:t>model</w:t>
+      </w:r>
+    </w:p>
+    <w:p>
+      <w:pPr>
+        <w:rPr>
+          <w:rFonts w:ascii="Times New Roman" w:hAnsi="Times New Roman" w:cs="Times New Roman"/>
+          <w:sz w:val="24"/>
+          <w:szCs w:val="24"/>
+        </w:rPr>
+      </w:pPr>
+      <w:r>
+        <w:rPr>
+          <w:rFonts w:ascii="Times New Roman" w:hAnsi="Times New Roman" w:cs="Times New Roman"/>
+          <w:sz w:val="24"/>
+          <w:szCs w:val="24"/>
+        </w:rPr>
+        <w:t>A car can:</w:t>
+      </w:r>
+    </w:p>
+    <w:p>
+      <w:pPr>
+        <w:numPr>
+          <w:ilvl w:val="0"/>
+          <w:numId w:val="17"/>
+        </w:numPr>
+        <w:rPr>
+          <w:rFonts w:ascii="Times New Roman" w:hAnsi="Times New Roman" w:cs="Times New Roman"/>
+          <w:sz w:val="24"/>
+          <w:szCs w:val="24"/>
+        </w:rPr>
+      </w:pPr>
+      <w:r>
+        <w:rPr>
+          <w:rFonts w:ascii="Times New Roman" w:hAnsi="Times New Roman" w:cs="Times New Roman"/>
+          <w:sz w:val="24"/>
+          <w:szCs w:val="24"/>
+        </w:rPr>
+        <w:t>start</w:t>
+      </w:r>
+    </w:p>
+    <w:p>
+      <w:pPr>
+        <w:numPr>
+          <w:ilvl w:val="0"/>
+          <w:numId w:val="17"/>
+        </w:numPr>
+        <w:rPr>
+          <w:rFonts w:ascii="Times New Roman" w:hAnsi="Times New Roman" w:cs="Times New Roman"/>
+          <w:sz w:val="24"/>
+          <w:szCs w:val="24"/>
+        </w:rPr>
+      </w:pPr>
+      <w:r>
+        <w:rPr>
+          <w:rFonts w:ascii="Times New Roman" w:hAnsi="Times New Roman" w:cs="Times New Roman"/>
+          <w:sz w:val="24"/>
+          <w:szCs w:val="24"/>
+        </w:rPr>
+        <w:t>stop</w:t>
+      </w:r>
+    </w:p>
+    <w:p>
+      <w:pPr>
+        <w:numPr>
+          <w:ilvl w:val="0"/>
+          <w:numId w:val="17"/>
+        </w:numPr>
+        <w:rPr>
+          <w:rFonts w:ascii="Times New Roman" w:hAnsi="Times New Roman" w:cs="Times New Roman"/>
+          <w:sz w:val="24"/>
+          <w:szCs w:val="24"/>
+        </w:rPr>
+      </w:pPr>
+      <w:r>
+        <w:rPr>
+          <w:rFonts w:ascii="Times New Roman" w:hAnsi="Times New Roman" w:cs="Times New Roman"/>
+          <w:sz w:val="24"/>
+          <w:szCs w:val="24"/>
+        </w:rPr>
+        <w:t>accelerate</w:t>
+      </w:r>
+    </w:p>
+    <w:p>
+      <w:pPr>
+        <w:rPr>
+          <w:rFonts w:ascii="Times New Roman" w:hAnsi="Times New Roman" w:cs="Times New Roman"/>
+          <w:sz w:val="24"/>
+          <w:szCs w:val="24"/>
+        </w:rPr>
+      </w:pPr>
+      <w:r>
+        <w:rPr>
+          <w:rFonts w:ascii="Times New Roman" w:hAnsi="Times New Roman" w:cs="Times New Roman"/>
+          <w:sz w:val="24"/>
+          <w:szCs w:val="24"/>
+        </w:rPr>
+        <w:t xml:space="preserve">So we create a </w:t>
+      </w:r>
+      <w:r>
+        <w:rPr>
+          <w:rFonts w:ascii="Times New Roman" w:hAnsi="Times New Roman" w:cs="Times New Roman"/>
+          <w:b/>
+          <w:bCs/>
+          <w:sz w:val="24"/>
+          <w:szCs w:val="24"/>
+        </w:rPr>
+        <w:t>Car class</w:t>
+      </w:r>
+      <w:r>
+        <w:rPr>
+          <w:rFonts w:ascii="Times New Roman" w:hAnsi="Times New Roman" w:cs="Times New Roman"/>
+          <w:sz w:val="24"/>
+          <w:szCs w:val="24"/>
+        </w:rPr>
+        <w:t>.</w:t>
+      </w:r>
+    </w:p>
+    <w:p>
+      <w:pPr>
+        <w:rPr>
+          <w:rFonts w:ascii="Times New Roman" w:hAnsi="Times New Roman" w:cs="Times New Roman"/>
+          <w:sz w:val="24"/>
+          <w:szCs w:val="24"/>
+        </w:rPr>
+      </w:pPr>
+      <w:r>
+        <w:rPr>
+          <w:rFonts w:ascii="Times New Roman" w:hAnsi="Times New Roman" w:cs="Times New Roman"/>
+          <w:sz w:val="24"/>
+          <w:szCs w:val="24"/>
+        </w:rPr>
+        <w:t>Again — this is only a design.</w:t>
+      </w:r>
+    </w:p>
+    <w:p>
+      <w:pPr>
+        <w:rPr>
+          <w:rFonts w:ascii="Times New Roman" w:hAnsi="Times New Roman" w:cs="Times New Roman"/>
+          <w:b/>
+          <w:bCs/>
+          <w:color w:val="EE0000"/>
+          <w:sz w:val="28"/>
+        </w:rPr>
+      </w:pPr>
+      <w:r>
+        <w:rPr>
+          <w:rFonts w:ascii="Times New Roman" w:hAnsi="Times New Roman" w:cs="Times New Roman"/>
+          <w:b/>
+          <w:bCs/>
+          <w:color w:val="EE0000"/>
+          <w:sz w:val="28"/>
+        </w:rPr>
+        <w:t>Q</w:t>
+      </w:r>
+      <w:r>
+        <w:rPr>
+          <w:rFonts w:ascii="Times New Roman" w:hAnsi="Times New Roman" w:cs="Times New Roman"/>
+          <w:b/>
+          <w:bCs/>
+          <w:color w:val="EE0000"/>
+          <w:sz w:val="28"/>
+        </w:rPr>
+        <w:t>5</w:t>
+      </w:r>
+      <w:r>
+        <w:rPr>
+          <w:rFonts w:ascii="Times New Roman" w:hAnsi="Times New Roman" w:cs="Times New Roman"/>
+          <w:b/>
+          <w:bCs/>
+          <w:color w:val="EE0000"/>
+          <w:sz w:val="28"/>
+        </w:rPr>
+        <w:t xml:space="preserve">. </w:t>
+      </w:r>
+      <w:r>
+        <w:rPr>
+          <w:rFonts w:ascii="Times New Roman" w:hAnsi="Times New Roman" w:cs="Times New Roman"/>
+          <w:b/>
+          <w:bCs/>
+          <w:color w:val="EE0000"/>
+          <w:sz w:val="28"/>
+        </w:rPr>
+        <w:t>What is an Object?</w:t>
+      </w:r>
+    </w:p>
+    <w:p>
+      <w:pPr>
+        <w:rPr>
+          <w:rFonts w:ascii="Times New Roman" w:hAnsi="Times New Roman" w:cs="Times New Roman"/>
+          <w:sz w:val="24"/>
+          <w:szCs w:val="24"/>
+        </w:rPr>
+      </w:pPr>
+      <w:r>
+        <w:rPr>
+          <w:rFonts w:ascii="Times New Roman" w:hAnsi="Times New Roman" w:cs="Times New Roman"/>
+          <w:sz w:val="24"/>
+          <w:szCs w:val="24"/>
+        </w:rPr>
+        <w:t xml:space="preserve">An </w:t>
+      </w:r>
+      <w:r>
+        <w:rPr>
+          <w:rFonts w:ascii="Times New Roman" w:hAnsi="Times New Roman" w:cs="Times New Roman"/>
+          <w:b/>
+          <w:bCs/>
+          <w:sz w:val="24"/>
+          <w:szCs w:val="24"/>
+        </w:rPr>
+        <w:t>object</w:t>
+      </w:r>
+      <w:r>
+        <w:rPr>
+          <w:rFonts w:ascii="Times New Roman" w:hAnsi="Times New Roman" w:cs="Times New Roman"/>
+          <w:sz w:val="24"/>
+          <w:szCs w:val="24"/>
+        </w:rPr>
+        <w:t xml:space="preserve"> is a real thing created from a class.</w:t>
+      </w:r>
+    </w:p>
+    <w:p>
+      <w:pPr>
+        <w:rPr>
+          <w:rFonts w:ascii="Times New Roman" w:hAnsi="Times New Roman" w:cs="Times New Roman"/>
+          <w:sz w:val="24"/>
+          <w:szCs w:val="24"/>
+        </w:rPr>
+      </w:pPr>
+      <w:r>
+        <w:rPr>
+          <w:rFonts w:ascii="Times New Roman" w:hAnsi="Times New Roman" w:cs="Times New Roman"/>
+          <w:sz w:val="24"/>
+          <w:szCs w:val="24"/>
+        </w:rPr>
+        <w:t>If class is a blueprint,</w:t>
+      </w:r>
+      <w:r>
+        <w:rPr>
+          <w:rFonts w:ascii="Times New Roman" w:hAnsi="Times New Roman" w:cs="Times New Roman"/>
+          <w:sz w:val="24"/>
+          <w:szCs w:val="24"/>
+        </w:rPr>
+        <w:br/>
+        <w:t>object is the real building.</w:t>
+      </w:r>
+    </w:p>
+    <w:p>
+      <w:pPr>
+        <w:rPr>
+          <w:rFonts w:ascii="Times New Roman" w:hAnsi="Times New Roman" w:cs="Times New Roman"/>
+          <w:sz w:val="24"/>
+          <w:szCs w:val="24"/>
+        </w:rPr>
+      </w:pPr>
+      <w:r>
+        <w:rPr>
+          <w:rFonts w:ascii="Times New Roman" w:hAnsi="Times New Roman" w:cs="Times New Roman"/>
+          <w:sz w:val="24"/>
+          <w:szCs w:val="24"/>
+        </w:rPr>
+        <w:t>If class is a design of car,</w:t>
+      </w:r>
+      <w:r>
+        <w:rPr>
+          <w:rFonts w:ascii="Times New Roman" w:hAnsi="Times New Roman" w:cs="Times New Roman"/>
+          <w:sz w:val="24"/>
+          <w:szCs w:val="24"/>
+        </w:rPr>
+        <w:br/>
+        <w:t>object is the real car.</w:t>
+      </w:r>
+    </w:p>
+    <w:p>
+      <w:pPr>
+        <w:rPr>
+          <w:rFonts w:ascii="Times New Roman" w:hAnsi="Times New Roman" w:cs="Times New Roman"/>
+          <w:b/>
+          <w:bCs/>
+          <w:sz w:val="24"/>
+          <w:szCs w:val="24"/>
+        </w:rPr>
+      </w:pPr>
+      <w:r>
+        <w:rPr>
+          <w:rFonts w:ascii="Times New Roman" w:hAnsi="Times New Roman" w:cs="Times New Roman"/>
+          <w:b/>
+          <w:bCs/>
+          <w:sz w:val="24"/>
+          <w:szCs w:val="24"/>
+        </w:rPr>
+        <w:t>Example</w:t>
+      </w:r>
+    </w:p>
+    <w:p>
+      <w:pPr>
+        <w:rPr>
+          <w:rFonts w:ascii="Times New Roman" w:hAnsi="Times New Roman" w:cs="Times New Roman"/>
+          <w:sz w:val="24"/>
+          <w:szCs w:val="24"/>
+        </w:rPr>
+      </w:pPr>
+      <w:r>
+        <w:rPr>
+          <w:rFonts w:ascii="Times New Roman" w:hAnsi="Times New Roman" w:cs="Times New Roman"/>
+          <w:sz w:val="24"/>
+          <w:szCs w:val="24"/>
+        </w:rPr>
+        <w:t>Student class → defines structure</w:t>
+      </w:r>
+      <w:r>
+        <w:rPr>
+          <w:rFonts w:ascii="Times New Roman" w:hAnsi="Times New Roman" w:cs="Times New Roman"/>
+          <w:sz w:val="24"/>
+          <w:szCs w:val="24"/>
+        </w:rPr>
+        <w:br/>
+      </w:r>
+      <w:r>
+        <w:rPr>
+          <w:rFonts w:ascii="Times New Roman" w:hAnsi="Times New Roman" w:cs="Times New Roman"/>
+          <w:sz w:val="24"/>
+          <w:szCs w:val="24"/>
+        </w:rPr>
+        <w:t>Ajay</w:t>
+      </w:r>
+      <w:r>
+        <w:rPr>
+          <w:rFonts w:ascii="Times New Roman" w:hAnsi="Times New Roman" w:cs="Times New Roman"/>
+          <w:sz w:val="24"/>
+          <w:szCs w:val="24"/>
+        </w:rPr>
+        <w:t xml:space="preserve"> (student1) → object</w:t>
+      </w:r>
+    </w:p>
+    <w:p>
+      <w:pPr>
+        <w:rPr>
+          <w:rFonts w:ascii="Times New Roman" w:hAnsi="Times New Roman" w:cs="Times New Roman"/>
+          <w:sz w:val="24"/>
+          <w:szCs w:val="24"/>
+        </w:rPr>
+      </w:pPr>
+      <w:r>
+        <w:rPr>
+          <w:rFonts w:ascii="Times New Roman" w:hAnsi="Times New Roman" w:cs="Times New Roman"/>
+          <w:sz w:val="24"/>
+          <w:szCs w:val="24"/>
+        </w:rPr>
+        <w:t>Car class → defines structure</w:t>
+      </w:r>
+      <w:r>
+        <w:rPr>
+          <w:rFonts w:ascii="Times New Roman" w:hAnsi="Times New Roman" w:cs="Times New Roman"/>
+          <w:sz w:val="24"/>
+          <w:szCs w:val="24"/>
+        </w:rPr>
+        <w:br/>
+        <w:t>MyCar → object</w:t>
+      </w:r>
+    </w:p>
+    <w:p>
+      <w:pPr>
+        <w:rPr>
+          <w:rFonts w:ascii="Times New Roman" w:hAnsi="Times New Roman" w:cs="Times New Roman"/>
+          <w:sz w:val="24"/>
+          <w:szCs w:val="24"/>
+        </w:rPr>
+      </w:pPr>
+      <w:r>
+        <w:rPr>
+          <w:rFonts w:ascii="Times New Roman" w:hAnsi="Times New Roman" w:cs="Times New Roman"/>
+          <w:sz w:val="24"/>
+          <w:szCs w:val="24"/>
+        </w:rPr>
+        <w:t>You can create many objects from one class.</w:t>
+      </w:r>
+    </w:p>
+    <w:p>
+      <w:pPr>
+        <w:rPr>
+          <w:rFonts w:ascii="Times New Roman" w:hAnsi="Times New Roman" w:cs="Times New Roman"/>
+          <w:b/>
+          <w:bCs/>
+          <w:sz w:val="24"/>
+          <w:szCs w:val="24"/>
+        </w:rPr>
+      </w:pPr>
+      <w:r>
+        <w:rPr>
+          <w:rFonts w:ascii="Times New Roman" w:hAnsi="Times New Roman" w:cs="Times New Roman"/>
+          <w:b/>
+          <w:bCs/>
+          <w:sz w:val="24"/>
+          <w:szCs w:val="24"/>
+        </w:rPr>
+        <w:t>Difference in Very Simple Words</w:t>
+      </w:r>
+    </w:p>
+    <w:tbl>
+      <w:tblPr>
+        <w:tblW w:w="0" w:type="auto"/>
+        <w:tblCellSpacing w:w="15" w:type="dxa"/>
+        <w:tblCellMar>
+          <w:top w:w="15" w:type="dxa"/>
+          <w:left w:w="15" w:type="dxa"/>
+          <w:bottom w:w="15" w:type="dxa"/>
+          <w:right w:w="15" w:type="dxa"/>
+        </w:tblCellMar>
+        <w:tblLook w:val="04A0" w:firstRow="1" w:lastRow="0" w:firstColumn="1" w:lastColumn="0" w:noHBand="0" w:noVBand="1"/>
+      </w:tblPr>
+      <w:tblGrid>
+        <w:gridCol w:w="2428"/>
+        <w:gridCol w:w="2148"/>
+      </w:tblGrid>
+      <w:tr>
+        <w:trPr>
+          <w:tblHeader/>
+          <w:tblCellSpacing w:w="15" w:type="dxa"/>
+        </w:trPr>
+        <w:tc>
+          <w:tcPr>
+            <w:tcW w:w="0" w:type="auto"/>
+            <w:vAlign w:val="center"/>
+            <w:hideMark/>
+          </w:tcPr>
+          <w:p>
+            <w:pPr>
+              <w:rPr>
+                <w:rFonts w:ascii="Times New Roman" w:hAnsi="Times New Roman" w:cs="Times New Roman"/>
+                <w:b/>
+                <w:bCs/>
+                <w:sz w:val="24"/>
+                <w:szCs w:val="24"/>
+              </w:rPr>
+            </w:pPr>
+            <w:r>
+              <w:rPr>
+                <w:rFonts w:ascii="Times New Roman" w:hAnsi="Times New Roman" w:cs="Times New Roman"/>
+                <w:b/>
+                <w:bCs/>
+                <w:sz w:val="24"/>
+                <w:szCs w:val="24"/>
+              </w:rPr>
+              <w:t>Class</w:t>
+            </w:r>
+          </w:p>
+        </w:tc>
+        <w:tc>
+          <w:tcPr>
+            <w:tcW w:w="0" w:type="auto"/>
+            <w:vAlign w:val="center"/>
+            <w:hideMark/>
+          </w:tcPr>
+          <w:p>
+            <w:pPr>
+              <w:rPr>
+                <w:rFonts w:ascii="Times New Roman" w:hAnsi="Times New Roman" w:cs="Times New Roman"/>
+                <w:b/>
+                <w:bCs/>
+                <w:sz w:val="24"/>
+                <w:szCs w:val="24"/>
+              </w:rPr>
+            </w:pPr>
+            <w:r>
+              <w:rPr>
+                <w:rFonts w:ascii="Times New Roman" w:hAnsi="Times New Roman" w:cs="Times New Roman"/>
+                <w:b/>
+                <w:bCs/>
+                <w:sz w:val="24"/>
+                <w:szCs w:val="24"/>
+              </w:rPr>
+              <w:t>Object</w:t>
+            </w:r>
+          </w:p>
+        </w:tc>
+      </w:tr>
+      <w:tr>
+        <w:trPr>
+          <w:tblCellSpacing w:w="15" w:type="dxa"/>
+        </w:trPr>
+        <w:tc>
+          <w:tcPr>
+            <w:tcW w:w="0" w:type="auto"/>
+            <w:vAlign w:val="center"/>
+            <w:hideMark/>
+          </w:tcPr>
+          <w:p>
+            <w:pPr>
+              <w:rPr>
+                <w:rFonts w:ascii="Times New Roman" w:hAnsi="Times New Roman" w:cs="Times New Roman"/>
+                <w:sz w:val="24"/>
+                <w:szCs w:val="24"/>
+              </w:rPr>
+            </w:pPr>
+            <w:r>
+              <w:rPr>
+                <w:rFonts w:ascii="Times New Roman" w:hAnsi="Times New Roman" w:cs="Times New Roman"/>
+                <w:sz w:val="24"/>
+                <w:szCs w:val="24"/>
+              </w:rPr>
+              <w:t>Blueprint</w:t>
+            </w:r>
+          </w:p>
+        </w:tc>
+        <w:tc>
+          <w:tcPr>
+            <w:tcW w:w="0" w:type="auto"/>
+            <w:vAlign w:val="center"/>
+            <w:hideMark/>
+          </w:tcPr>
+          <w:p>
+            <w:pPr>
+              <w:rPr>
+                <w:rFonts w:ascii="Times New Roman" w:hAnsi="Times New Roman" w:cs="Times New Roman"/>
+                <w:sz w:val="24"/>
+                <w:szCs w:val="24"/>
+              </w:rPr>
+            </w:pPr>
+            <w:r>
+              <w:rPr>
+                <w:rFonts w:ascii="Times New Roman" w:hAnsi="Times New Roman" w:cs="Times New Roman"/>
+                <w:sz w:val="24"/>
+                <w:szCs w:val="24"/>
+              </w:rPr>
+              <w:t>Real thing</w:t>
+            </w:r>
+          </w:p>
+        </w:tc>
+      </w:tr>
+      <w:tr>
+        <w:trPr>
+          <w:tblCellSpacing w:w="15" w:type="dxa"/>
+        </w:trPr>
+        <w:tc>
+          <w:tcPr>
+            <w:tcW w:w="0" w:type="auto"/>
+            <w:vAlign w:val="center"/>
+            <w:hideMark/>
+          </w:tcPr>
+          <w:p>
+            <w:pPr>
+              <w:rPr>
+                <w:rFonts w:ascii="Times New Roman" w:hAnsi="Times New Roman" w:cs="Times New Roman"/>
+                <w:sz w:val="24"/>
+                <w:szCs w:val="24"/>
+              </w:rPr>
+            </w:pPr>
+            <w:r>
+              <w:rPr>
+                <w:rFonts w:ascii="Times New Roman" w:hAnsi="Times New Roman" w:cs="Times New Roman"/>
+                <w:sz w:val="24"/>
+                <w:szCs w:val="24"/>
+              </w:rPr>
+              <w:t>Logical</w:t>
+            </w:r>
+          </w:p>
+        </w:tc>
+        <w:tc>
+          <w:tcPr>
+            <w:tcW w:w="0" w:type="auto"/>
+            <w:vAlign w:val="center"/>
+            <w:hideMark/>
+          </w:tcPr>
+          <w:p>
+            <w:pPr>
+              <w:rPr>
+                <w:rFonts w:ascii="Times New Roman" w:hAnsi="Times New Roman" w:cs="Times New Roman"/>
+                <w:sz w:val="24"/>
+                <w:szCs w:val="24"/>
+              </w:rPr>
+            </w:pPr>
+            <w:r>
+              <w:rPr>
+                <w:rFonts w:ascii="Times New Roman" w:hAnsi="Times New Roman" w:cs="Times New Roman"/>
+                <w:sz w:val="24"/>
+                <w:szCs w:val="24"/>
+              </w:rPr>
+              <w:t>Physical</w:t>
+            </w:r>
+          </w:p>
+        </w:tc>
+      </w:tr>
+      <w:tr>
+        <w:trPr>
+          <w:tblCellSpacing w:w="15" w:type="dxa"/>
+        </w:trPr>
+        <w:tc>
+          <w:tcPr>
+            <w:tcW w:w="0" w:type="auto"/>
+            <w:vAlign w:val="center"/>
+            <w:hideMark/>
+          </w:tcPr>
+          <w:p>
+            <w:pPr>
+              <w:rPr>
+                <w:rFonts w:ascii="Times New Roman" w:hAnsi="Times New Roman" w:cs="Times New Roman"/>
+                <w:sz w:val="24"/>
+                <w:szCs w:val="24"/>
+              </w:rPr>
+            </w:pPr>
+            <w:r>
+              <w:rPr>
+                <w:rFonts w:ascii="Times New Roman" w:hAnsi="Times New Roman" w:cs="Times New Roman"/>
+                <w:sz w:val="24"/>
+                <w:szCs w:val="24"/>
+              </w:rPr>
+              <w:t>Defines data and actions</w:t>
+            </w:r>
+          </w:p>
+        </w:tc>
+        <w:tc>
+          <w:tcPr>
+            <w:tcW w:w="0" w:type="auto"/>
+            <w:vAlign w:val="center"/>
+            <w:hideMark/>
+          </w:tcPr>
+          <w:p>
+            <w:pPr>
+              <w:rPr>
+                <w:rFonts w:ascii="Times New Roman" w:hAnsi="Times New Roman" w:cs="Times New Roman"/>
+                <w:sz w:val="24"/>
+                <w:szCs w:val="24"/>
+              </w:rPr>
+            </w:pPr>
+            <w:r>
+              <w:rPr>
+                <w:rFonts w:ascii="Times New Roman" w:hAnsi="Times New Roman" w:cs="Times New Roman"/>
+                <w:sz w:val="24"/>
+                <w:szCs w:val="24"/>
+              </w:rPr>
+              <w:t>Uses data and actions</w:t>
+            </w:r>
+          </w:p>
+        </w:tc>
+      </w:tr>
+    </w:tbl>
+    <w:p>
+      <w:pPr>
+        <w:rPr>
+          <w:rFonts w:ascii="Times New Roman" w:hAnsi="Times New Roman" w:cs="Times New Roman"/>
+          <w:b/>
+          <w:bCs/>
+          <w:sz w:val="24"/>
+          <w:szCs w:val="24"/>
+        </w:rPr>
+      </w:pPr>
+      <w:r>
+        <w:rPr>
+          <w:rFonts w:ascii="Times New Roman" w:hAnsi="Times New Roman" w:cs="Times New Roman"/>
+          <w:b/>
+          <w:bCs/>
+          <w:sz w:val="24"/>
+          <w:szCs w:val="24"/>
+        </w:rPr>
+        <w:lastRenderedPageBreak/>
+        <w:t>Small Example: Box Class</w:t>
+      </w:r>
+    </w:p>
+    <w:p>
+      <w:pPr>
+        <w:rPr>
+          <w:rFonts w:ascii="Times New Roman" w:hAnsi="Times New Roman" w:cs="Times New Roman"/>
+          <w:sz w:val="24"/>
+          <w:szCs w:val="24"/>
+        </w:rPr>
+      </w:pPr>
+      <w:r>
+        <w:rPr>
+          <w:rFonts w:ascii="Times New Roman" w:hAnsi="Times New Roman" w:cs="Times New Roman"/>
+          <w:sz w:val="24"/>
+          <w:szCs w:val="24"/>
+        </w:rPr>
+        <w:t xml:space="preserve">Now let us create a simple class called </w:t>
+      </w:r>
+      <w:r>
+        <w:rPr>
+          <w:rFonts w:ascii="Times New Roman" w:hAnsi="Times New Roman" w:cs="Times New Roman"/>
+          <w:b/>
+          <w:bCs/>
+          <w:sz w:val="24"/>
+          <w:szCs w:val="24"/>
+        </w:rPr>
+        <w:t>Box</w:t>
+      </w:r>
+      <w:r>
+        <w:rPr>
+          <w:rFonts w:ascii="Times New Roman" w:hAnsi="Times New Roman" w:cs="Times New Roman"/>
+          <w:sz w:val="24"/>
+          <w:szCs w:val="24"/>
+        </w:rPr>
+        <w:t>.</w:t>
+      </w:r>
+    </w:p>
+    <w:p>
+      <w:pPr>
+        <w:rPr>
+          <w:rFonts w:ascii="Times New Roman" w:hAnsi="Times New Roman" w:cs="Times New Roman"/>
+          <w:sz w:val="24"/>
+          <w:szCs w:val="24"/>
+        </w:rPr>
+      </w:pPr>
+      <w:r>
+        <w:rPr>
+          <w:rFonts w:ascii="Times New Roman" w:hAnsi="Times New Roman" w:cs="Times New Roman"/>
+          <w:sz w:val="24"/>
+          <w:szCs w:val="24"/>
+        </w:rPr>
+        <w:t>A box has:</w:t>
+      </w:r>
+    </w:p>
+    <w:p>
+      <w:pPr>
+        <w:numPr>
+          <w:ilvl w:val="0"/>
+          <w:numId w:val="18"/>
+        </w:numPr>
+        <w:rPr>
+          <w:rFonts w:ascii="Times New Roman" w:hAnsi="Times New Roman" w:cs="Times New Roman"/>
+          <w:sz w:val="24"/>
+          <w:szCs w:val="24"/>
+        </w:rPr>
+      </w:pPr>
+      <w:r>
+        <w:rPr>
+          <w:rFonts w:ascii="Times New Roman" w:hAnsi="Times New Roman" w:cs="Times New Roman"/>
+          <w:sz w:val="24"/>
+          <w:szCs w:val="24"/>
+        </w:rPr>
+        <w:t>length</w:t>
+      </w:r>
+    </w:p>
+    <w:p>
+      <w:pPr>
+        <w:numPr>
+          <w:ilvl w:val="0"/>
+          <w:numId w:val="18"/>
+        </w:numPr>
+        <w:rPr>
+          <w:rFonts w:ascii="Times New Roman" w:hAnsi="Times New Roman" w:cs="Times New Roman"/>
+          <w:sz w:val="24"/>
+          <w:szCs w:val="24"/>
+        </w:rPr>
+      </w:pPr>
+      <w:r>
+        <w:rPr>
+          <w:rFonts w:ascii="Times New Roman" w:hAnsi="Times New Roman" w:cs="Times New Roman"/>
+          <w:sz w:val="24"/>
+          <w:szCs w:val="24"/>
+        </w:rPr>
+        <w:t>width</w:t>
+      </w:r>
+    </w:p>
+    <w:p>
+      <w:pPr>
+        <w:numPr>
+          <w:ilvl w:val="0"/>
+          <w:numId w:val="18"/>
+        </w:numPr>
+        <w:rPr>
+          <w:rFonts w:ascii="Times New Roman" w:hAnsi="Times New Roman" w:cs="Times New Roman"/>
+          <w:sz w:val="24"/>
+          <w:szCs w:val="24"/>
+        </w:rPr>
+      </w:pPr>
+      <w:r>
+        <w:rPr>
+          <w:rFonts w:ascii="Times New Roman" w:hAnsi="Times New Roman" w:cs="Times New Roman"/>
+          <w:sz w:val="24"/>
+          <w:szCs w:val="24"/>
+        </w:rPr>
+        <w:t>height</w:t>
+      </w:r>
+    </w:p>
+    <w:p>
+      <w:pPr>
+        <w:rPr>
+          <w:rFonts w:ascii="Times New Roman" w:hAnsi="Times New Roman" w:cs="Times New Roman"/>
+          <w:sz w:val="24"/>
+          <w:szCs w:val="24"/>
+        </w:rPr>
+      </w:pPr>
+      <w:r>
+        <w:rPr>
+          <w:rFonts w:ascii="Times New Roman" w:hAnsi="Times New Roman" w:cs="Times New Roman"/>
+          <w:sz w:val="24"/>
+          <w:szCs w:val="24"/>
+        </w:rPr>
+        <w:t>And it can:</w:t>
+      </w:r>
+    </w:p>
+    <w:p>
+      <w:pPr>
+        <w:numPr>
+          <w:ilvl w:val="0"/>
+          <w:numId w:val="19"/>
+        </w:numPr>
+        <w:rPr>
+          <w:rFonts w:ascii="Times New Roman" w:hAnsi="Times New Roman" w:cs="Times New Roman"/>
+          <w:sz w:val="24"/>
+          <w:szCs w:val="24"/>
+        </w:rPr>
+      </w:pPr>
+      <w:r>
+        <w:rPr>
+          <w:rFonts w:ascii="Times New Roman" w:hAnsi="Times New Roman" w:cs="Times New Roman"/>
+          <w:sz w:val="24"/>
+          <w:szCs w:val="24"/>
+        </w:rPr>
+        <w:t>calculate volume</w:t>
+      </w:r>
+    </w:p>
+    <w:p>
+      <w:pPr>
+        <w:rPr>
+          <w:rFonts w:ascii="Times New Roman" w:hAnsi="Times New Roman" w:cs="Times New Roman"/>
+          <w:b/>
+          <w:bCs/>
+          <w:sz w:val="24"/>
+          <w:szCs w:val="24"/>
+        </w:rPr>
+      </w:pPr>
+      <w:r>
+        <w:rPr>
+          <w:rFonts w:ascii="Times New Roman" w:hAnsi="Times New Roman" w:cs="Times New Roman"/>
+          <w:b/>
+          <w:bCs/>
+          <w:sz w:val="24"/>
+          <w:szCs w:val="24"/>
+        </w:rPr>
+        <w:t>Java Program</w:t>
+      </w:r>
+    </w:p>
+    <w:p>
+      <w:pPr>
+        <w:rPr>
+          <w:rFonts w:ascii="Times New Roman" w:hAnsi="Times New Roman" w:cs="Times New Roman"/>
+          <w:sz w:val="24"/>
+          <w:szCs w:val="24"/>
+        </w:rPr>
+      </w:pPr>
+      <w:r>
+        <w:rPr>
+          <w:rFonts w:ascii="Times New Roman" w:hAnsi="Times New Roman" w:cs="Times New Roman"/>
+          <w:sz w:val="24"/>
+          <w:szCs w:val="24"/>
+        </w:rPr>
+        <w:t>class Box {</w:t>
+      </w:r>
+    </w:p>
+    <w:p>
+      <w:pPr>
+        <w:rPr>
+          <w:rFonts w:ascii="Times New Roman" w:hAnsi="Times New Roman" w:cs="Times New Roman"/>
+          <w:sz w:val="24"/>
+          <w:szCs w:val="24"/>
+        </w:rPr>
+      </w:pPr>
+      <w:r>
+        <w:rPr>
+          <w:rFonts w:ascii="Times New Roman" w:hAnsi="Times New Roman" w:cs="Times New Roman"/>
+          <w:sz w:val="24"/>
+          <w:szCs w:val="24"/>
+        </w:rPr>
+        <w:t xml:space="preserve">    </w:t>
+      </w:r>
+      <w:r>
+        <w:rPr>
+          <w:rFonts w:ascii="Times New Roman" w:hAnsi="Times New Roman" w:cs="Times New Roman"/>
+          <w:sz w:val="24"/>
+          <w:szCs w:val="24"/>
+        </w:rPr>
+        <w:tab/>
+      </w:r>
+      <w:r>
+        <w:rPr>
+          <w:rFonts w:ascii="Times New Roman" w:hAnsi="Times New Roman" w:cs="Times New Roman"/>
+          <w:sz w:val="24"/>
+          <w:szCs w:val="24"/>
+        </w:rPr>
+        <w:t>// Data (variables)</w:t>
+      </w:r>
+      <w:r>
+        <w:rPr>
+          <w:rFonts w:ascii="Times New Roman" w:hAnsi="Times New Roman" w:cs="Times New Roman"/>
+          <w:sz w:val="24"/>
+          <w:szCs w:val="24"/>
+        </w:rPr>
+        <w:t xml:space="preserve"> - Properties</w:t>
+      </w:r>
+    </w:p>
+    <w:p>
+      <w:pPr>
+        <w:rPr>
+          <w:rFonts w:ascii="Times New Roman" w:hAnsi="Times New Roman" w:cs="Times New Roman"/>
+          <w:sz w:val="24"/>
+          <w:szCs w:val="24"/>
+        </w:rPr>
+      </w:pPr>
+      <w:r>
+        <w:rPr>
+          <w:rFonts w:ascii="Times New Roman" w:hAnsi="Times New Roman" w:cs="Times New Roman"/>
+          <w:sz w:val="24"/>
+          <w:szCs w:val="24"/>
+        </w:rPr>
+        <w:t xml:space="preserve">    </w:t>
+      </w:r>
+      <w:r>
+        <w:rPr>
+          <w:rFonts w:ascii="Times New Roman" w:hAnsi="Times New Roman" w:cs="Times New Roman"/>
+          <w:sz w:val="24"/>
+          <w:szCs w:val="24"/>
+        </w:rPr>
+        <w:tab/>
+      </w:r>
+      <w:r>
+        <w:rPr>
+          <w:rFonts w:ascii="Times New Roman" w:hAnsi="Times New Roman" w:cs="Times New Roman"/>
+          <w:sz w:val="24"/>
+          <w:szCs w:val="24"/>
+        </w:rPr>
+        <w:t>double length;</w:t>
+      </w:r>
+    </w:p>
+    <w:p>
+      <w:pPr>
+        <w:rPr>
+          <w:rFonts w:ascii="Times New Roman" w:hAnsi="Times New Roman" w:cs="Times New Roman"/>
+          <w:sz w:val="24"/>
+          <w:szCs w:val="24"/>
+        </w:rPr>
+      </w:pPr>
+      <w:r>
+        <w:rPr>
+          <w:rFonts w:ascii="Times New Roman" w:hAnsi="Times New Roman" w:cs="Times New Roman"/>
+          <w:sz w:val="24"/>
+          <w:szCs w:val="24"/>
+        </w:rPr>
+        <w:t xml:space="preserve">   </w:t>
+      </w:r>
+      <w:r>
+        <w:rPr>
+          <w:rFonts w:ascii="Times New Roman" w:hAnsi="Times New Roman" w:cs="Times New Roman"/>
+          <w:sz w:val="24"/>
+          <w:szCs w:val="24"/>
+        </w:rPr>
+        <w:tab/>
+      </w:r>
+      <w:r>
+        <w:rPr>
+          <w:rFonts w:ascii="Times New Roman" w:hAnsi="Times New Roman" w:cs="Times New Roman"/>
+          <w:sz w:val="24"/>
+          <w:szCs w:val="24"/>
+        </w:rPr>
+        <w:t xml:space="preserve"> double width;</w:t>
+      </w:r>
+    </w:p>
+    <w:p>
+      <w:pPr>
+        <w:rPr>
+          <w:rFonts w:ascii="Times New Roman" w:hAnsi="Times New Roman" w:cs="Times New Roman"/>
+          <w:sz w:val="24"/>
+          <w:szCs w:val="24"/>
+        </w:rPr>
+      </w:pPr>
+      <w:r>
+        <w:rPr>
+          <w:rFonts w:ascii="Times New Roman" w:hAnsi="Times New Roman" w:cs="Times New Roman"/>
+          <w:sz w:val="24"/>
+          <w:szCs w:val="24"/>
+        </w:rPr>
+        <w:t xml:space="preserve">    </w:t>
+      </w:r>
+      <w:r>
+        <w:rPr>
+          <w:rFonts w:ascii="Times New Roman" w:hAnsi="Times New Roman" w:cs="Times New Roman"/>
+          <w:sz w:val="24"/>
+          <w:szCs w:val="24"/>
+        </w:rPr>
+        <w:tab/>
+      </w:r>
+      <w:r>
+        <w:rPr>
+          <w:rFonts w:ascii="Times New Roman" w:hAnsi="Times New Roman" w:cs="Times New Roman"/>
+          <w:sz w:val="24"/>
+          <w:szCs w:val="24"/>
+        </w:rPr>
+        <w:t>double height;</w:t>
+      </w:r>
+    </w:p>
+    <w:p>
+      <w:pPr>
+        <w:rPr>
+          <w:rFonts w:ascii="Times New Roman" w:hAnsi="Times New Roman" w:cs="Times New Roman"/>
+          <w:sz w:val="24"/>
+          <w:szCs w:val="24"/>
+        </w:rPr>
+      </w:pPr>
+    </w:p>
+    <w:p>
+      <w:pPr>
+        <w:rPr>
+          <w:rFonts w:ascii="Times New Roman" w:hAnsi="Times New Roman" w:cs="Times New Roman"/>
+          <w:sz w:val="24"/>
+          <w:szCs w:val="24"/>
+        </w:rPr>
+      </w:pPr>
+      <w:r>
+        <w:rPr>
+          <w:rFonts w:ascii="Times New Roman" w:hAnsi="Times New Roman" w:cs="Times New Roman"/>
+          <w:sz w:val="24"/>
+          <w:szCs w:val="24"/>
+        </w:rPr>
+        <w:t xml:space="preserve">    // Method (function)</w:t>
+      </w:r>
+    </w:p>
+    <w:p>
+      <w:pPr>
+        <w:rPr>
+          <w:rFonts w:ascii="Times New Roman" w:hAnsi="Times New Roman" w:cs="Times New Roman"/>
+          <w:sz w:val="24"/>
+          <w:szCs w:val="24"/>
+        </w:rPr>
+      </w:pPr>
+      <w:r>
+        <w:rPr>
+          <w:rFonts w:ascii="Times New Roman" w:hAnsi="Times New Roman" w:cs="Times New Roman"/>
+          <w:sz w:val="24"/>
+          <w:szCs w:val="24"/>
+        </w:rPr>
+        <w:t xml:space="preserve">    double calculateVolume() {</w:t>
+      </w:r>
+    </w:p>
+    <w:p>
+      <w:pPr>
+        <w:rPr>
+          <w:rFonts w:ascii="Times New Roman" w:hAnsi="Times New Roman" w:cs="Times New Roman"/>
+          <w:sz w:val="24"/>
+          <w:szCs w:val="24"/>
+        </w:rPr>
+      </w:pPr>
+      <w:r>
+        <w:rPr>
+          <w:rFonts w:ascii="Times New Roman" w:hAnsi="Times New Roman" w:cs="Times New Roman"/>
+          <w:sz w:val="24"/>
+          <w:szCs w:val="24"/>
+        </w:rPr>
+        <w:t xml:space="preserve">        return length * width * height;</w:t>
+      </w:r>
+    </w:p>
+    <w:p>
+      <w:pPr>
+        <w:rPr>
+          <w:rFonts w:ascii="Times New Roman" w:hAnsi="Times New Roman" w:cs="Times New Roman"/>
+          <w:sz w:val="24"/>
+          <w:szCs w:val="24"/>
+        </w:rPr>
+      </w:pPr>
+      <w:r>
+        <w:rPr>
+          <w:rFonts w:ascii="Times New Roman" w:hAnsi="Times New Roman" w:cs="Times New Roman"/>
+          <w:sz w:val="24"/>
+          <w:szCs w:val="24"/>
+        </w:rPr>
+        <w:t xml:space="preserve">    }</w:t>
+      </w:r>
+    </w:p>
+    <w:p>
+      <w:pPr>
+        <w:rPr>
+          <w:rFonts w:ascii="Times New Roman" w:hAnsi="Times New Roman" w:cs="Times New Roman"/>
+          <w:sz w:val="24"/>
+          <w:szCs w:val="24"/>
+        </w:rPr>
+      </w:pPr>
+      <w:r>
+        <w:rPr>
+          <w:rFonts w:ascii="Times New Roman" w:hAnsi="Times New Roman" w:cs="Times New Roman"/>
+          <w:sz w:val="24"/>
+          <w:szCs w:val="24"/>
+        </w:rPr>
+        <w:t xml:space="preserve">    public static void main(String[] args) {</w:t>
+      </w:r>
+    </w:p>
+    <w:p>
+      <w:pPr>
+        <w:rPr>
+          <w:rFonts w:ascii="Times New Roman" w:hAnsi="Times New Roman" w:cs="Times New Roman"/>
+          <w:sz w:val="24"/>
+          <w:szCs w:val="24"/>
+        </w:rPr>
+      </w:pPr>
+      <w:r>
+        <w:rPr>
+          <w:rFonts w:ascii="Times New Roman" w:hAnsi="Times New Roman" w:cs="Times New Roman"/>
+          <w:sz w:val="24"/>
+          <w:szCs w:val="24"/>
+        </w:rPr>
+        <w:t xml:space="preserve">        // Creating object</w:t>
+      </w:r>
+    </w:p>
+    <w:p>
+      <w:pPr>
+        <w:rPr>
+          <w:rFonts w:ascii="Times New Roman" w:hAnsi="Times New Roman" w:cs="Times New Roman"/>
+          <w:sz w:val="24"/>
+          <w:szCs w:val="24"/>
+        </w:rPr>
+      </w:pPr>
+      <w:r>
+        <w:rPr>
+          <w:rFonts w:ascii="Times New Roman" w:hAnsi="Times New Roman" w:cs="Times New Roman"/>
+          <w:sz w:val="24"/>
+          <w:szCs w:val="24"/>
+        </w:rPr>
+        <w:t xml:space="preserve">        Box box1 = new Box();</w:t>
+      </w:r>
+    </w:p>
+    <w:p>
+      <w:pPr>
+        <w:rPr>
+          <w:rFonts w:ascii="Times New Roman" w:hAnsi="Times New Roman" w:cs="Times New Roman"/>
+          <w:sz w:val="24"/>
+          <w:szCs w:val="24"/>
+        </w:rPr>
+      </w:pPr>
+      <w:r>
+        <w:rPr>
+          <w:rFonts w:ascii="Times New Roman" w:hAnsi="Times New Roman" w:cs="Times New Roman"/>
+          <w:sz w:val="24"/>
+          <w:szCs w:val="24"/>
+        </w:rPr>
+        <w:t xml:space="preserve">        // Assigning values</w:t>
+      </w:r>
+    </w:p>
+    <w:p>
+      <w:pPr>
+        <w:rPr>
+          <w:rFonts w:ascii="Times New Roman" w:hAnsi="Times New Roman" w:cs="Times New Roman"/>
+          <w:sz w:val="24"/>
+          <w:szCs w:val="24"/>
+        </w:rPr>
+      </w:pPr>
+      <w:r>
+        <w:rPr>
+          <w:rFonts w:ascii="Times New Roman" w:hAnsi="Times New Roman" w:cs="Times New Roman"/>
+          <w:sz w:val="24"/>
+          <w:szCs w:val="24"/>
+        </w:rPr>
+        <w:t xml:space="preserve">        box1.length = 5;</w:t>
+      </w:r>
+    </w:p>
+    <w:p>
+      <w:pPr>
+        <w:rPr>
+          <w:rFonts w:ascii="Times New Roman" w:hAnsi="Times New Roman" w:cs="Times New Roman"/>
+          <w:sz w:val="24"/>
+          <w:szCs w:val="24"/>
+        </w:rPr>
+      </w:pPr>
+      <w:r>
+        <w:rPr>
+          <w:rFonts w:ascii="Times New Roman" w:hAnsi="Times New Roman" w:cs="Times New Roman"/>
+          <w:sz w:val="24"/>
+          <w:szCs w:val="24"/>
+        </w:rPr>
+        <w:t xml:space="preserve">        box1.width = 4;</w:t>
+      </w:r>
+    </w:p>
+    <w:p>
+      <w:pPr>
+        <w:rPr>
+          <w:rFonts w:ascii="Times New Roman" w:hAnsi="Times New Roman" w:cs="Times New Roman"/>
+          <w:sz w:val="24"/>
+          <w:szCs w:val="24"/>
+        </w:rPr>
+      </w:pPr>
+      <w:r>
+        <w:rPr>
+          <w:rFonts w:ascii="Times New Roman" w:hAnsi="Times New Roman" w:cs="Times New Roman"/>
+          <w:sz w:val="24"/>
+          <w:szCs w:val="24"/>
+        </w:rPr>
+        <w:t xml:space="preserve">        box1.height = 3;</w:t>
+      </w:r>
+    </w:p>
+    <w:p>
+      <w:pPr>
+        <w:rPr>
+          <w:rFonts w:ascii="Times New Roman" w:hAnsi="Times New Roman" w:cs="Times New Roman"/>
+          <w:sz w:val="24"/>
+          <w:szCs w:val="24"/>
+        </w:rPr>
+      </w:pPr>
+      <w:r>
+        <w:rPr>
+          <w:rFonts w:ascii="Times New Roman" w:hAnsi="Times New Roman" w:cs="Times New Roman"/>
+          <w:sz w:val="24"/>
+          <w:szCs w:val="24"/>
+        </w:rPr>
+        <w:t xml:space="preserve">        // Calling method</w:t>
+      </w:r>
+    </w:p>
+    <w:p>
+      <w:pPr>
+        <w:rPr>
+          <w:rFonts w:ascii="Times New Roman" w:hAnsi="Times New Roman" w:cs="Times New Roman"/>
+          <w:sz w:val="24"/>
+          <w:szCs w:val="24"/>
+        </w:rPr>
+      </w:pPr>
+      <w:r>
+        <w:rPr>
+          <w:rFonts w:ascii="Times New Roman" w:hAnsi="Times New Roman" w:cs="Times New Roman"/>
+          <w:sz w:val="24"/>
+          <w:szCs w:val="24"/>
+        </w:rPr>
+        <w:t xml:space="preserve">        double volume = box1.calculateVolume();</w:t>
+      </w:r>
+    </w:p>
+    <w:p>
+      <w:pPr>
+        <w:rPr>
+          <w:rFonts w:ascii="Times New Roman" w:hAnsi="Times New Roman" w:cs="Times New Roman"/>
+          <w:sz w:val="24"/>
+          <w:szCs w:val="24"/>
+        </w:rPr>
+      </w:pPr>
+      <w:r>
+        <w:rPr>
+          <w:rFonts w:ascii="Times New Roman" w:hAnsi="Times New Roman" w:cs="Times New Roman"/>
+          <w:sz w:val="24"/>
+          <w:szCs w:val="24"/>
+        </w:rPr>
+        <w:t xml:space="preserve">        System.out.println("Volume of Box = " + volume);</w:t>
+      </w:r>
+    </w:p>
+    <w:p>
+      <w:pPr>
+        <w:rPr>
+          <w:rFonts w:ascii="Times New Roman" w:hAnsi="Times New Roman" w:cs="Times New Roman"/>
+          <w:sz w:val="24"/>
+          <w:szCs w:val="24"/>
+        </w:rPr>
+      </w:pPr>
+      <w:r>
+        <w:rPr>
+          <w:rFonts w:ascii="Times New Roman" w:hAnsi="Times New Roman" w:cs="Times New Roman"/>
+          <w:sz w:val="24"/>
+          <w:szCs w:val="24"/>
+        </w:rPr>
+        <w:t xml:space="preserve">    }</w:t>
+      </w:r>
+    </w:p>
+    <w:p>
+      <w:pPr>
+        <w:rPr>
+          <w:rFonts w:ascii="Times New Roman" w:hAnsi="Times New Roman" w:cs="Times New Roman"/>
+          <w:sz w:val="24"/>
+          <w:szCs w:val="24"/>
+        </w:rPr>
+      </w:pPr>
+      <w:r>
+        <w:rPr>
+          <w:rFonts w:ascii="Times New Roman" w:hAnsi="Times New Roman" w:cs="Times New Roman"/>
+          <w:sz w:val="24"/>
+          <w:szCs w:val="24"/>
+        </w:rPr>
+        <w:lastRenderedPageBreak/>
+        <w:t>}</w:t>
+      </w:r>
+    </w:p>
+    <w:p>
+      <w:pPr>
+        <w:rPr>
+          <w:rFonts w:ascii="Times New Roman" w:hAnsi="Times New Roman" w:cs="Times New Roman"/>
+          <w:b/>
+          <w:bCs/>
+          <w:sz w:val="24"/>
+          <w:szCs w:val="24"/>
+        </w:rPr>
+      </w:pPr>
+      <w:r>
+        <w:rPr>
+          <w:rFonts w:ascii="Times New Roman" w:hAnsi="Times New Roman" w:cs="Times New Roman"/>
+          <w:b/>
+          <w:bCs/>
+          <w:sz w:val="24"/>
+          <w:szCs w:val="24"/>
+        </w:rPr>
+        <w:t>Explanation in Very Simple Words</w:t>
+      </w:r>
+    </w:p>
+    <w:p>
+      <w:pPr>
+        <w:rPr>
+          <w:rFonts w:ascii="Times New Roman" w:hAnsi="Times New Roman" w:cs="Times New Roman"/>
+          <w:b/>
+          <w:bCs/>
+          <w:sz w:val="24"/>
+          <w:szCs w:val="24"/>
+        </w:rPr>
+      </w:pPr>
+      <w:r>
+        <w:rPr>
+          <w:rFonts w:ascii="Times New Roman" w:hAnsi="Times New Roman" w:cs="Times New Roman"/>
+          <w:b/>
+          <w:bCs/>
+          <w:sz w:val="24"/>
+          <w:szCs w:val="24"/>
+        </w:rPr>
+        <w:t>class Box</w:t>
+      </w:r>
+    </w:p>
+    <w:p>
+      <w:pPr>
+        <w:rPr>
+          <w:rFonts w:ascii="Times New Roman" w:hAnsi="Times New Roman" w:cs="Times New Roman"/>
+          <w:sz w:val="24"/>
+          <w:szCs w:val="24"/>
+        </w:rPr>
+      </w:pPr>
+      <w:r>
+        <w:rPr>
+          <w:rFonts w:ascii="Times New Roman" w:hAnsi="Times New Roman" w:cs="Times New Roman"/>
+          <w:sz w:val="24"/>
+          <w:szCs w:val="24"/>
+        </w:rPr>
+        <w:t>We created a blueprint named Box.</w:t>
+      </w:r>
+    </w:p>
+    <w:p>
+      <w:pPr>
+        <w:rPr>
+          <w:rFonts w:ascii="Times New Roman" w:hAnsi="Times New Roman" w:cs="Times New Roman"/>
+          <w:b/>
+          <w:bCs/>
+          <w:sz w:val="24"/>
+          <w:szCs w:val="24"/>
+        </w:rPr>
+      </w:pPr>
+      <w:r>
+        <w:rPr>
+          <w:rFonts w:ascii="Times New Roman" w:hAnsi="Times New Roman" w:cs="Times New Roman"/>
+          <w:b/>
+          <w:bCs/>
+          <w:sz w:val="24"/>
+          <w:szCs w:val="24"/>
+        </w:rPr>
+        <w:t>Variables</w:t>
+      </w:r>
+    </w:p>
+    <w:p>
+      <w:pPr>
+        <w:rPr>
+          <w:rFonts w:ascii="Times New Roman" w:hAnsi="Times New Roman" w:cs="Times New Roman"/>
+          <w:sz w:val="24"/>
+          <w:szCs w:val="24"/>
+        </w:rPr>
+      </w:pPr>
+      <w:r>
+        <w:rPr>
+          <w:rFonts w:ascii="Times New Roman" w:hAnsi="Times New Roman" w:cs="Times New Roman"/>
+          <w:sz w:val="24"/>
+          <w:szCs w:val="24"/>
+        </w:rPr>
+        <w:t>double length;</w:t>
+      </w:r>
+    </w:p>
+    <w:p>
+      <w:pPr>
+        <w:rPr>
+          <w:rFonts w:ascii="Times New Roman" w:hAnsi="Times New Roman" w:cs="Times New Roman"/>
+          <w:sz w:val="24"/>
+          <w:szCs w:val="24"/>
+        </w:rPr>
+      </w:pPr>
+      <w:r>
+        <w:rPr>
+          <w:rFonts w:ascii="Times New Roman" w:hAnsi="Times New Roman" w:cs="Times New Roman"/>
+          <w:sz w:val="24"/>
+          <w:szCs w:val="24"/>
+        </w:rPr>
+        <w:t>double width;</w:t>
+      </w:r>
+    </w:p>
+    <w:p>
+      <w:pPr>
+        <w:rPr>
+          <w:rFonts w:ascii="Times New Roman" w:hAnsi="Times New Roman" w:cs="Times New Roman"/>
+          <w:sz w:val="24"/>
+          <w:szCs w:val="24"/>
+        </w:rPr>
+      </w:pPr>
+      <w:r>
+        <w:rPr>
+          <w:rFonts w:ascii="Times New Roman" w:hAnsi="Times New Roman" w:cs="Times New Roman"/>
+          <w:sz w:val="24"/>
+          <w:szCs w:val="24"/>
+        </w:rPr>
+        <w:t>double height;</w:t>
+      </w:r>
+    </w:p>
+    <w:p>
+      <w:pPr>
+        <w:rPr>
+          <w:rFonts w:ascii="Times New Roman" w:hAnsi="Times New Roman" w:cs="Times New Roman"/>
+          <w:sz w:val="24"/>
+          <w:szCs w:val="24"/>
+        </w:rPr>
+      </w:pPr>
+      <w:r>
+        <w:rPr>
+          <w:rFonts w:ascii="Times New Roman" w:hAnsi="Times New Roman" w:cs="Times New Roman"/>
+          <w:sz w:val="24"/>
+          <w:szCs w:val="24"/>
+        </w:rPr>
+        <w:t>These are data members.</w:t>
+      </w:r>
+      <w:r>
+        <w:rPr>
+          <w:rFonts w:ascii="Times New Roman" w:hAnsi="Times New Roman" w:cs="Times New Roman"/>
+          <w:sz w:val="24"/>
+          <w:szCs w:val="24"/>
+        </w:rPr>
+        <w:br/>
+        <w:t>They store information about the box.</w:t>
+      </w:r>
+    </w:p>
+    <w:p>
+      <w:pPr>
+        <w:rPr>
+          <w:rFonts w:ascii="Times New Roman" w:hAnsi="Times New Roman" w:cs="Times New Roman"/>
+          <w:b/>
+          <w:bCs/>
+          <w:sz w:val="24"/>
+          <w:szCs w:val="24"/>
+        </w:rPr>
+      </w:pPr>
+      <w:r>
+        <w:rPr>
+          <w:rFonts w:ascii="Times New Roman" w:hAnsi="Times New Roman" w:cs="Times New Roman"/>
+          <w:b/>
+          <w:bCs/>
+          <w:sz w:val="24"/>
+          <w:szCs w:val="24"/>
+        </w:rPr>
+        <w:t>Method</w:t>
+      </w:r>
+    </w:p>
+    <w:p>
+      <w:pPr>
+        <w:rPr>
+          <w:rFonts w:ascii="Times New Roman" w:hAnsi="Times New Roman" w:cs="Times New Roman"/>
+          <w:sz w:val="24"/>
+          <w:szCs w:val="24"/>
+        </w:rPr>
+      </w:pPr>
+      <w:r>
+        <w:rPr>
+          <w:rFonts w:ascii="Times New Roman" w:hAnsi="Times New Roman" w:cs="Times New Roman"/>
+          <w:sz w:val="24"/>
+          <w:szCs w:val="24"/>
+        </w:rPr>
+        <w:t>double calculateVolume()</w:t>
+      </w:r>
+    </w:p>
+    <w:p>
+      <w:pPr>
+        <w:rPr>
+          <w:rFonts w:ascii="Times New Roman" w:hAnsi="Times New Roman" w:cs="Times New Roman"/>
+          <w:sz w:val="24"/>
+          <w:szCs w:val="24"/>
+        </w:rPr>
+      </w:pPr>
+      <w:r>
+        <w:rPr>
+          <w:rFonts w:ascii="Times New Roman" w:hAnsi="Times New Roman" w:cs="Times New Roman"/>
+          <w:sz w:val="24"/>
+          <w:szCs w:val="24"/>
+        </w:rPr>
+        <w:t>This is an action.</w:t>
+      </w:r>
+      <w:r>
+        <w:rPr>
+          <w:rFonts w:ascii="Times New Roman" w:hAnsi="Times New Roman" w:cs="Times New Roman"/>
+          <w:sz w:val="24"/>
+          <w:szCs w:val="24"/>
+        </w:rPr>
+        <w:br/>
+        <w:t>It calculates volume.</w:t>
+      </w:r>
+    </w:p>
+    <w:p>
+      <w:pPr>
+        <w:rPr>
+          <w:rFonts w:ascii="Times New Roman" w:hAnsi="Times New Roman" w:cs="Times New Roman"/>
+          <w:b/>
+          <w:bCs/>
+          <w:sz w:val="24"/>
+          <w:szCs w:val="24"/>
+        </w:rPr>
+      </w:pPr>
+      <w:r>
+        <w:rPr>
+          <w:rFonts w:ascii="Times New Roman" w:hAnsi="Times New Roman" w:cs="Times New Roman"/>
+          <w:b/>
+          <w:bCs/>
+          <w:sz w:val="24"/>
+          <w:szCs w:val="24"/>
+        </w:rPr>
+        <w:t>Object Creation</w:t>
+      </w:r>
+    </w:p>
+    <w:p>
+      <w:pPr>
+        <w:rPr>
+          <w:rFonts w:ascii="Times New Roman" w:hAnsi="Times New Roman" w:cs="Times New Roman"/>
+          <w:sz w:val="24"/>
+          <w:szCs w:val="24"/>
+        </w:rPr>
+      </w:pPr>
+      <w:r>
+        <w:rPr>
+          <w:rFonts w:ascii="Times New Roman" w:hAnsi="Times New Roman" w:cs="Times New Roman"/>
+          <w:sz w:val="24"/>
+          <w:szCs w:val="24"/>
+        </w:rPr>
+        <w:t>Box box1 = new Box();</w:t>
+      </w:r>
+    </w:p>
+    <w:p>
+      <w:pPr>
+        <w:rPr>
+          <w:rFonts w:ascii="Times New Roman" w:hAnsi="Times New Roman" w:cs="Times New Roman"/>
+          <w:sz w:val="24"/>
+          <w:szCs w:val="24"/>
+        </w:rPr>
+      </w:pPr>
+      <w:r>
+        <w:rPr>
+          <w:rFonts w:ascii="Times New Roman" w:hAnsi="Times New Roman" w:cs="Times New Roman"/>
+          <w:sz w:val="24"/>
+          <w:szCs w:val="24"/>
+        </w:rPr>
+        <w:t>Here we created a real box object from the class.</w:t>
+      </w:r>
+    </w:p>
+    <w:p>
+      <w:pPr>
+        <w:rPr>
+          <w:rFonts w:ascii="Times New Roman" w:hAnsi="Times New Roman" w:cs="Times New Roman"/>
+          <w:b/>
+          <w:bCs/>
+          <w:sz w:val="24"/>
+          <w:szCs w:val="24"/>
+        </w:rPr>
+      </w:pPr>
+      <w:r>
+        <w:rPr>
+          <w:rFonts w:ascii="Times New Roman" w:hAnsi="Times New Roman" w:cs="Times New Roman"/>
+          <w:b/>
+          <w:bCs/>
+          <w:sz w:val="24"/>
+          <w:szCs w:val="24"/>
+        </w:rPr>
+        <w:t>Assign Values</w:t>
+      </w:r>
+    </w:p>
+    <w:p>
+      <w:pPr>
+        <w:rPr>
+          <w:rFonts w:ascii="Times New Roman" w:hAnsi="Times New Roman" w:cs="Times New Roman"/>
+          <w:sz w:val="24"/>
+          <w:szCs w:val="24"/>
+        </w:rPr>
+      </w:pPr>
+      <w:r>
+        <w:rPr>
+          <w:rFonts w:ascii="Times New Roman" w:hAnsi="Times New Roman" w:cs="Times New Roman"/>
+          <w:sz w:val="24"/>
+          <w:szCs w:val="24"/>
+        </w:rPr>
+        <w:t>We gave dimensions to the box.</w:t>
+      </w:r>
+    </w:p>
+    <w:p>
+      <w:pPr>
+        <w:rPr>
+          <w:rFonts w:ascii="Times New Roman" w:hAnsi="Times New Roman" w:cs="Times New Roman"/>
+          <w:b/>
+          <w:bCs/>
+          <w:sz w:val="24"/>
+          <w:szCs w:val="24"/>
+        </w:rPr>
+      </w:pPr>
+      <w:r>
+        <w:rPr>
+          <w:rFonts w:ascii="Times New Roman" w:hAnsi="Times New Roman" w:cs="Times New Roman"/>
+          <w:b/>
+          <w:bCs/>
+          <w:sz w:val="24"/>
+          <w:szCs w:val="24"/>
+        </w:rPr>
+        <w:t>Call Method</w:t>
+      </w:r>
+    </w:p>
+    <w:p>
+      <w:pPr>
+        <w:rPr>
+          <w:rFonts w:ascii="Times New Roman" w:hAnsi="Times New Roman" w:cs="Times New Roman"/>
+          <w:sz w:val="24"/>
+          <w:szCs w:val="24"/>
+        </w:rPr>
+      </w:pPr>
+      <w:r>
+        <w:rPr>
+          <w:rFonts w:ascii="Times New Roman" w:hAnsi="Times New Roman" w:cs="Times New Roman"/>
+          <w:sz w:val="24"/>
+          <w:szCs w:val="24"/>
+        </w:rPr>
+        <w:t>We called the method to calculate volume.</w:t>
+      </w:r>
+    </w:p>
+    <w:p>
+      <w:pPr>
+        <w:rPr>
+          <w:rFonts w:ascii="Times New Roman" w:hAnsi="Times New Roman" w:cs="Times New Roman"/>
+          <w:b/>
+          <w:bCs/>
+          <w:sz w:val="24"/>
+          <w:szCs w:val="24"/>
+        </w:rPr>
+      </w:pPr>
+      <w:r>
+        <w:rPr>
+          <w:rFonts w:ascii="Times New Roman" w:hAnsi="Times New Roman" w:cs="Times New Roman"/>
+          <w:b/>
+          <w:bCs/>
+          <w:sz w:val="24"/>
+          <w:szCs w:val="24"/>
+        </w:rPr>
+        <w:t>Final Understanding</w:t>
+      </w:r>
+    </w:p>
+    <w:p>
+      <w:pPr>
+        <w:rPr>
+          <w:rFonts w:ascii="Times New Roman" w:hAnsi="Times New Roman" w:cs="Times New Roman"/>
+          <w:sz w:val="24"/>
+          <w:szCs w:val="24"/>
+        </w:rPr>
+      </w:pPr>
+      <w:r>
+        <w:rPr>
+          <w:rFonts w:ascii="Times New Roman" w:hAnsi="Times New Roman" w:cs="Times New Roman"/>
+          <w:sz w:val="24"/>
+          <w:szCs w:val="24"/>
+        </w:rPr>
+        <w:t>Class = Design</w:t>
+      </w:r>
+      <w:r>
+        <w:rPr>
+          <w:rFonts w:ascii="Times New Roman" w:hAnsi="Times New Roman" w:cs="Times New Roman"/>
+          <w:sz w:val="24"/>
+          <w:szCs w:val="24"/>
+        </w:rPr>
+        <w:br/>
+        <w:t>Object = Real thing created from design</w:t>
+      </w:r>
+      <w:r>
+        <w:rPr>
+          <w:rFonts w:ascii="Times New Roman" w:hAnsi="Times New Roman" w:cs="Times New Roman"/>
+          <w:sz w:val="24"/>
+          <w:szCs w:val="24"/>
+        </w:rPr>
+        <w:br/>
+        <w:t>Variables = Data</w:t>
+      </w:r>
+      <w:r>
+        <w:rPr>
+          <w:rFonts w:ascii="Times New Roman" w:hAnsi="Times New Roman" w:cs="Times New Roman"/>
+          <w:sz w:val="24"/>
+          <w:szCs w:val="24"/>
+        </w:rPr>
+        <w:br/>
+        <w:t>Methods = Actions</w:t>
+      </w:r>
+    </w:p>
+    <w:p>
+      <w:pPr>
+        <w:rPr>
+          <w:rFonts w:ascii="Times New Roman" w:hAnsi="Times New Roman" w:cs="Times New Roman"/>
+          <w:sz w:val="24"/>
+          <w:szCs w:val="24"/>
+        </w:rPr>
+      </w:pPr>
+      <w:r>
+        <w:rPr>
+          <w:rFonts w:ascii="Times New Roman" w:hAnsi="Times New Roman" w:cs="Times New Roman"/>
+          <w:sz w:val="24"/>
+          <w:szCs w:val="24"/>
+        </w:rPr>
+        <w:t>This is the heart of Object-Oriented Programming.</w:t>
+      </w:r>
+    </w:p>
+    <w:p>
+      <w:pPr>
+        <w:rPr>
+          <w:rFonts w:ascii="Times New Roman" w:hAnsi="Times New Roman" w:cs="Times New Roman"/>
           <w:sz w:val="24"/>
           <w:szCs w:val="24"/>
         </w:rPr>
@@ -3601,6 +5788,155 @@
     </w:lvl>
   </w:abstractNum>
   <w:abstractNum w:abstractNumId="3" w15:restartNumberingAfterBreak="0">
+    <w:nsid w:val="23453EE6"/>
+    <w:multiLevelType w:val="multilevel"/>
+    <w:tmpl w:val="735864B4"/>
+    <w:lvl w:ilvl="0">
+      <w:start w:val="1"/>
+      <w:numFmt w:val="bullet"/>
+      <w:lvlText w:val=""/>
+      <w:lvlJc w:val="left"/>
+      <w:pPr>
+        <w:tabs>
+          <w:tab w:val="num" w:pos="720"/>
+        </w:tabs>
+        <w:ind w:left="720" w:hanging="360"/>
+      </w:pPr>
+      <w:rPr>
+        <w:rFonts w:ascii="Symbol" w:hAnsi="Symbol" w:hint="default"/>
+        <w:sz w:val="20"/>
+      </w:rPr>
+    </w:lvl>
+    <w:lvl w:ilvl="1" w:tentative="1">
+      <w:start w:val="1"/>
+      <w:numFmt w:val="bullet"/>
+      <w:lvlText w:val="o"/>
+      <w:lvlJc w:val="left"/>
+      <w:pPr>
+        <w:tabs>
+          <w:tab w:val="num" w:pos="1440"/>
+        </w:tabs>
+        <w:ind w:left="1440" w:hanging="360"/>
+      </w:pPr>
+      <w:rPr>
+        <w:rFonts w:ascii="Courier New" w:hAnsi="Courier New" w:hint="default"/>
+        <w:sz w:val="20"/>
+      </w:rPr>
+    </w:lvl>
+    <w:lvl w:ilvl="2" w:tentative="1">
+      <w:start w:val="1"/>
+      <w:numFmt w:val="bullet"/>
+      <w:lvlText w:val=""/>
+      <w:lvlJc w:val="left"/>
+      <w:pPr>
+        <w:tabs>
+          <w:tab w:val="num" w:pos="2160"/>
+        </w:tabs>
+        <w:ind w:left="2160" w:hanging="360"/>
+      </w:pPr>
+      <w:rPr>
+        <w:rFonts w:ascii="Wingdings" w:hAnsi="Wingdings" w:hint="default"/>
+        <w:sz w:val="20"/>
+      </w:rPr>
+    </w:lvl>
+    <w:lvl w:ilvl="3" w:tentative="1">
+      <w:start w:val="1"/>
+      <w:numFmt w:val="bullet"/>
+      <w:lvlText w:val=""/>
+      <w:lvlJc w:val="left"/>
+      <w:pPr>
+        <w:tabs>
+          <w:tab w:val="num" w:pos="2880"/>
+        </w:tabs>
+        <w:ind w:left="2880" w:hanging="360"/>
+      </w:pPr>
+      <w:rPr>
+        <w:rFonts w:ascii="Wingdings" w:hAnsi="Wingdings" w:hint="default"/>
+        <w:sz w:val="20"/>
+      </w:rPr>
+    </w:lvl>
+    <w:lvl w:ilvl="4" w:tentative="1">
+      <w:start w:val="1"/>
+      <w:numFmt w:val="bullet"/>
+      <w:lvlText w:val=""/>
+      <w:lvlJc w:val="left"/>
+      <w:pPr>
+        <w:tabs>
+          <w:tab w:val="num" w:pos="3600"/>
+        </w:tabs>
+        <w:ind w:left="3600" w:hanging="360"/>
+      </w:pPr>
+      <w:rPr>
+        <w:rFonts w:ascii="Wingdings" w:hAnsi="Wingdings" w:hint="default"/>
+        <w:sz w:val="20"/>
+      </w:rPr>
+    </w:lvl>
+    <w:lvl w:ilvl="5" w:tentative="1">
+      <w:start w:val="1"/>
+      <w:numFmt w:val="bullet"/>
+      <w:lvlText w:val=""/>
+      <w:lvlJc w:val="left"/>
+      <w:pPr>
+        <w:tabs>
+          <w:tab w:val="num" w:pos="4320"/>
+        </w:tabs>
+        <w:ind w:left="4320" w:hanging="360"/>
+      </w:pPr>
+      <w:rPr>
+        <w:rFonts w:ascii="Wingdings" w:hAnsi="Wingdings" w:hint="default"/>
+        <w:sz w:val="20"/>
+      </w:rPr>
+    </w:lvl>
+    <w:lvl w:ilvl="6" w:tentative="1">
+      <w:start w:val="1"/>
+      <w:numFmt w:val="bullet"/>
+      <w:lvlText w:val=""/>
+      <w:lvlJc w:val="left"/>
+      <w:pPr>
+        <w:tabs>
+          <w:tab w:val="num" w:pos="5040"/>
+        </w:tabs>
+        <w:ind w:left="5040" w:hanging="360"/>
+      </w:pPr>
+      <w:rPr>
+        <w:rFonts w:ascii="Wingdings" w:hAnsi="Wingdings" w:hint="default"/>
+        <w:sz w:val="20"/>
+      </w:rPr>
+    </w:lvl>
+    <w:lvl w:ilvl="7" w:tentative="1">
+      <w:start w:val="1"/>
+      <w:numFmt w:val="bullet"/>
+      <w:lvlText w:val=""/>
+      <w:lvlJc w:val="left"/>
+      <w:pPr>
+        <w:tabs>
+          <w:tab w:val="num" w:pos="5760"/>
+        </w:tabs>
+        <w:ind w:left="5760" w:hanging="360"/>
+      </w:pPr>
+      <w:rPr>
+        <w:rFonts w:ascii="Wingdings" w:hAnsi="Wingdings" w:hint="default"/>
+        <w:sz w:val="20"/>
+      </w:rPr>
+    </w:lvl>
+    <w:lvl w:ilvl="8" w:tentative="1">
+      <w:start w:val="1"/>
+      <w:numFmt w:val="bullet"/>
+      <w:lvlText w:val=""/>
+      <w:lvlJc w:val="left"/>
+      <w:pPr>
+        <w:tabs>
+          <w:tab w:val="num" w:pos="6480"/>
+        </w:tabs>
+        <w:ind w:left="6480" w:hanging="360"/>
+      </w:pPr>
+      <w:rPr>
+        <w:rFonts w:ascii="Wingdings" w:hAnsi="Wingdings" w:hint="default"/>
+        <w:sz w:val="20"/>
+      </w:rPr>
+    </w:lvl>
+  </w:abstractNum>
+  <w:abstractNum w:abstractNumId="4" w15:restartNumberingAfterBreak="0">
     <w:nsid w:val="27506F82"/>
     <w:multiLevelType w:val="multilevel"/>
     <w:tmpl w:val="3A22BE1E"/>
@@ -3749,7 +6085,7 @@
       </w:rPr>
     </w:lvl>
   </w:abstractNum>
-  <w:abstractNum w:abstractNumId="4" w15:restartNumberingAfterBreak="0">
+  <w:abstractNum w:abstractNumId="5" w15:restartNumberingAfterBreak="0">
     <w:nsid w:val="35941D8E"/>
     <w:multiLevelType w:val="multilevel"/>
     <w:tmpl w:val="2B2C8B7A"/>
@@ -3862,7 +6198,7 @@
       </w:pPr>
     </w:lvl>
   </w:abstractNum>
-  <w:abstractNum w:abstractNumId="5" w15:restartNumberingAfterBreak="0">
+  <w:abstractNum w:abstractNumId="6" w15:restartNumberingAfterBreak="0">
     <w:nsid w:val="3FED18DD"/>
     <w:multiLevelType w:val="multilevel"/>
     <w:tmpl w:val="FF1A5306"/>
@@ -4011,7 +6347,454 @@
       </w:rPr>
     </w:lvl>
   </w:abstractNum>
-  <w:abstractNum w:abstractNumId="6" w15:restartNumberingAfterBreak="0">
+  <w:abstractNum w:abstractNumId="7" w15:restartNumberingAfterBreak="0">
+    <w:nsid w:val="48A4063F"/>
+    <w:multiLevelType w:val="multilevel"/>
+    <w:tmpl w:val="B23E6078"/>
+    <w:lvl w:ilvl="0">
+      <w:start w:val="1"/>
+      <w:numFmt w:val="bullet"/>
+      <w:lvlText w:val=""/>
+      <w:lvlJc w:val="left"/>
+      <w:pPr>
+        <w:tabs>
+          <w:tab w:val="num" w:pos="720"/>
+        </w:tabs>
+        <w:ind w:left="720" w:hanging="360"/>
+      </w:pPr>
+      <w:rPr>
+        <w:rFonts w:ascii="Symbol" w:hAnsi="Symbol" w:hint="default"/>
+        <w:sz w:val="20"/>
+      </w:rPr>
+    </w:lvl>
+    <w:lvl w:ilvl="1" w:tentative="1">
+      <w:start w:val="1"/>
+      <w:numFmt w:val="bullet"/>
+      <w:lvlText w:val="o"/>
+      <w:lvlJc w:val="left"/>
+      <w:pPr>
+        <w:tabs>
+          <w:tab w:val="num" w:pos="1440"/>
+        </w:tabs>
+        <w:ind w:left="1440" w:hanging="360"/>
+      </w:pPr>
+      <w:rPr>
+        <w:rFonts w:ascii="Courier New" w:hAnsi="Courier New" w:hint="default"/>
+        <w:sz w:val="20"/>
+      </w:rPr>
+    </w:lvl>
+    <w:lvl w:ilvl="2" w:tentative="1">
+      <w:start w:val="1"/>
+      <w:numFmt w:val="bullet"/>
+      <w:lvlText w:val=""/>
+      <w:lvlJc w:val="left"/>
+      <w:pPr>
+        <w:tabs>
+          <w:tab w:val="num" w:pos="2160"/>
+        </w:tabs>
+        <w:ind w:left="2160" w:hanging="360"/>
+      </w:pPr>
+      <w:rPr>
+        <w:rFonts w:ascii="Wingdings" w:hAnsi="Wingdings" w:hint="default"/>
+        <w:sz w:val="20"/>
+      </w:rPr>
+    </w:lvl>
+    <w:lvl w:ilvl="3" w:tentative="1">
+      <w:start w:val="1"/>
+      <w:numFmt w:val="bullet"/>
+      <w:lvlText w:val=""/>
+      <w:lvlJc w:val="left"/>
+      <w:pPr>
+        <w:tabs>
+          <w:tab w:val="num" w:pos="2880"/>
+        </w:tabs>
+        <w:ind w:left="2880" w:hanging="360"/>
+      </w:pPr>
+      <w:rPr>
+        <w:rFonts w:ascii="Wingdings" w:hAnsi="Wingdings" w:hint="default"/>
+        <w:sz w:val="20"/>
+      </w:rPr>
+    </w:lvl>
+    <w:lvl w:ilvl="4" w:tentative="1">
+      <w:start w:val="1"/>
+      <w:numFmt w:val="bullet"/>
+      <w:lvlText w:val=""/>
+      <w:lvlJc w:val="left"/>
+      <w:pPr>
+        <w:tabs>
+          <w:tab w:val="num" w:pos="3600"/>
+        </w:tabs>
+        <w:ind w:left="3600" w:hanging="360"/>
+      </w:pPr>
+      <w:rPr>
+        <w:rFonts w:ascii="Wingdings" w:hAnsi="Wingdings" w:hint="default"/>
+        <w:sz w:val="20"/>
+      </w:rPr>
+    </w:lvl>
+    <w:lvl w:ilvl="5" w:tentative="1">
+      <w:start w:val="1"/>
+      <w:numFmt w:val="bullet"/>
+      <w:lvlText w:val=""/>
+      <w:lvlJc w:val="left"/>
+      <w:pPr>
+        <w:tabs>
+          <w:tab w:val="num" w:pos="4320"/>
+        </w:tabs>
+        <w:ind w:left="4320" w:hanging="360"/>
+      </w:pPr>
+      <w:rPr>
+        <w:rFonts w:ascii="Wingdings" w:hAnsi="Wingdings" w:hint="default"/>
+        <w:sz w:val="20"/>
+      </w:rPr>
+    </w:lvl>
+    <w:lvl w:ilvl="6" w:tentative="1">
+      <w:start w:val="1"/>
+      <w:numFmt w:val="bullet"/>
+      <w:lvlText w:val=""/>
+      <w:lvlJc w:val="left"/>
+      <w:pPr>
+        <w:tabs>
+          <w:tab w:val="num" w:pos="5040"/>
+        </w:tabs>
+        <w:ind w:left="5040" w:hanging="360"/>
+      </w:pPr>
+      <w:rPr>
+        <w:rFonts w:ascii="Wingdings" w:hAnsi="Wingdings" w:hint="default"/>
+        <w:sz w:val="20"/>
+      </w:rPr>
+    </w:lvl>
+    <w:lvl w:ilvl="7" w:tentative="1">
+      <w:start w:val="1"/>
+      <w:numFmt w:val="bullet"/>
+      <w:lvlText w:val=""/>
+      <w:lvlJc w:val="left"/>
+      <w:pPr>
+        <w:tabs>
+          <w:tab w:val="num" w:pos="5760"/>
+        </w:tabs>
+        <w:ind w:left="5760" w:hanging="360"/>
+      </w:pPr>
+      <w:rPr>
+        <w:rFonts w:ascii="Wingdings" w:hAnsi="Wingdings" w:hint="default"/>
+        <w:sz w:val="20"/>
+      </w:rPr>
+    </w:lvl>
+    <w:lvl w:ilvl="8" w:tentative="1">
+      <w:start w:val="1"/>
+      <w:numFmt w:val="bullet"/>
+      <w:lvlText w:val=""/>
+      <w:lvlJc w:val="left"/>
+      <w:pPr>
+        <w:tabs>
+          <w:tab w:val="num" w:pos="6480"/>
+        </w:tabs>
+        <w:ind w:left="6480" w:hanging="360"/>
+      </w:pPr>
+      <w:rPr>
+        <w:rFonts w:ascii="Wingdings" w:hAnsi="Wingdings" w:hint="default"/>
+        <w:sz w:val="20"/>
+      </w:rPr>
+    </w:lvl>
+  </w:abstractNum>
+  <w:abstractNum w:abstractNumId="8" w15:restartNumberingAfterBreak="0">
+    <w:nsid w:val="4AD91855"/>
+    <w:multiLevelType w:val="multilevel"/>
+    <w:tmpl w:val="30A4650A"/>
+    <w:lvl w:ilvl="0">
+      <w:start w:val="1"/>
+      <w:numFmt w:val="bullet"/>
+      <w:lvlText w:val=""/>
+      <w:lvlJc w:val="left"/>
+      <w:pPr>
+        <w:tabs>
+          <w:tab w:val="num" w:pos="720"/>
+        </w:tabs>
+        <w:ind w:left="720" w:hanging="360"/>
+      </w:pPr>
+      <w:rPr>
+        <w:rFonts w:ascii="Symbol" w:hAnsi="Symbol" w:hint="default"/>
+        <w:sz w:val="20"/>
+      </w:rPr>
+    </w:lvl>
+    <w:lvl w:ilvl="1" w:tentative="1">
+      <w:start w:val="1"/>
+      <w:numFmt w:val="bullet"/>
+      <w:lvlText w:val="o"/>
+      <w:lvlJc w:val="left"/>
+      <w:pPr>
+        <w:tabs>
+          <w:tab w:val="num" w:pos="1440"/>
+        </w:tabs>
+        <w:ind w:left="1440" w:hanging="360"/>
+      </w:pPr>
+      <w:rPr>
+        <w:rFonts w:ascii="Courier New" w:hAnsi="Courier New" w:hint="default"/>
+        <w:sz w:val="20"/>
+      </w:rPr>
+    </w:lvl>
+    <w:lvl w:ilvl="2" w:tentative="1">
+      <w:start w:val="1"/>
+      <w:numFmt w:val="bullet"/>
+      <w:lvlText w:val=""/>
+      <w:lvlJc w:val="left"/>
+      <w:pPr>
+        <w:tabs>
+          <w:tab w:val="num" w:pos="2160"/>
+        </w:tabs>
+        <w:ind w:left="2160" w:hanging="360"/>
+      </w:pPr>
+      <w:rPr>
+        <w:rFonts w:ascii="Wingdings" w:hAnsi="Wingdings" w:hint="default"/>
+        <w:sz w:val="20"/>
+      </w:rPr>
+    </w:lvl>
+    <w:lvl w:ilvl="3" w:tentative="1">
+      <w:start w:val="1"/>
+      <w:numFmt w:val="bullet"/>
+      <w:lvlText w:val=""/>
+      <w:lvlJc w:val="left"/>
+      <w:pPr>
+        <w:tabs>
+          <w:tab w:val="num" w:pos="2880"/>
+        </w:tabs>
+        <w:ind w:left="2880" w:hanging="360"/>
+      </w:pPr>
+      <w:rPr>
+        <w:rFonts w:ascii="Wingdings" w:hAnsi="Wingdings" w:hint="default"/>
+        <w:sz w:val="20"/>
+      </w:rPr>
+    </w:lvl>
+    <w:lvl w:ilvl="4" w:tentative="1">
+      <w:start w:val="1"/>
+      <w:numFmt w:val="bullet"/>
+      <w:lvlText w:val=""/>
+      <w:lvlJc w:val="left"/>
+      <w:pPr>
+        <w:tabs>
+          <w:tab w:val="num" w:pos="3600"/>
+        </w:tabs>
+        <w:ind w:left="3600" w:hanging="360"/>
+      </w:pPr>
+      <w:rPr>
+        <w:rFonts w:ascii="Wingdings" w:hAnsi="Wingdings" w:hint="default"/>
+        <w:sz w:val="20"/>
+      </w:rPr>
+    </w:lvl>
+    <w:lvl w:ilvl="5" w:tentative="1">
+      <w:start w:val="1"/>
+      <w:numFmt w:val="bullet"/>
+      <w:lvlText w:val=""/>
+      <w:lvlJc w:val="left"/>
+      <w:pPr>
+        <w:tabs>
+          <w:tab w:val="num" w:pos="4320"/>
+        </w:tabs>
+        <w:ind w:left="4320" w:hanging="360"/>
+      </w:pPr>
+      <w:rPr>
+        <w:rFonts w:ascii="Wingdings" w:hAnsi="Wingdings" w:hint="default"/>
+        <w:sz w:val="20"/>
+      </w:rPr>
+    </w:lvl>
+    <w:lvl w:ilvl="6" w:tentative="1">
+      <w:start w:val="1"/>
+      <w:numFmt w:val="bullet"/>
+      <w:lvlText w:val=""/>
+      <w:lvlJc w:val="left"/>
+      <w:pPr>
+        <w:tabs>
+          <w:tab w:val="num" w:pos="5040"/>
+        </w:tabs>
+        <w:ind w:left="5040" w:hanging="360"/>
+      </w:pPr>
+      <w:rPr>
+        <w:rFonts w:ascii="Wingdings" w:hAnsi="Wingdings" w:hint="default"/>
+        <w:sz w:val="20"/>
+      </w:rPr>
+    </w:lvl>
+    <w:lvl w:ilvl="7" w:tentative="1">
+      <w:start w:val="1"/>
+      <w:numFmt w:val="bullet"/>
+      <w:lvlText w:val=""/>
+      <w:lvlJc w:val="left"/>
+      <w:pPr>
+        <w:tabs>
+          <w:tab w:val="num" w:pos="5760"/>
+        </w:tabs>
+        <w:ind w:left="5760" w:hanging="360"/>
+      </w:pPr>
+      <w:rPr>
+        <w:rFonts w:ascii="Wingdings" w:hAnsi="Wingdings" w:hint="default"/>
+        <w:sz w:val="20"/>
+      </w:rPr>
+    </w:lvl>
+    <w:lvl w:ilvl="8" w:tentative="1">
+      <w:start w:val="1"/>
+      <w:numFmt w:val="bullet"/>
+      <w:lvlText w:val=""/>
+      <w:lvlJc w:val="left"/>
+      <w:pPr>
+        <w:tabs>
+          <w:tab w:val="num" w:pos="6480"/>
+        </w:tabs>
+        <w:ind w:left="6480" w:hanging="360"/>
+      </w:pPr>
+      <w:rPr>
+        <w:rFonts w:ascii="Wingdings" w:hAnsi="Wingdings" w:hint="default"/>
+        <w:sz w:val="20"/>
+      </w:rPr>
+    </w:lvl>
+  </w:abstractNum>
+  <w:abstractNum w:abstractNumId="9" w15:restartNumberingAfterBreak="0">
+    <w:nsid w:val="50CC7B1D"/>
+    <w:multiLevelType w:val="multilevel"/>
+    <w:tmpl w:val="C6E607BC"/>
+    <w:lvl w:ilvl="0">
+      <w:start w:val="1"/>
+      <w:numFmt w:val="bullet"/>
+      <w:lvlText w:val=""/>
+      <w:lvlJc w:val="left"/>
+      <w:pPr>
+        <w:tabs>
+          <w:tab w:val="num" w:pos="720"/>
+        </w:tabs>
+        <w:ind w:left="720" w:hanging="360"/>
+      </w:pPr>
+      <w:rPr>
+        <w:rFonts w:ascii="Symbol" w:hAnsi="Symbol" w:hint="default"/>
+        <w:sz w:val="20"/>
+      </w:rPr>
+    </w:lvl>
+    <w:lvl w:ilvl="1" w:tentative="1">
+      <w:start w:val="1"/>
+      <w:numFmt w:val="bullet"/>
+      <w:lvlText w:val="o"/>
+      <w:lvlJc w:val="left"/>
+      <w:pPr>
+        <w:tabs>
+          <w:tab w:val="num" w:pos="1440"/>
+        </w:tabs>
+        <w:ind w:left="1440" w:hanging="360"/>
+      </w:pPr>
+      <w:rPr>
+        <w:rFonts w:ascii="Courier New" w:hAnsi="Courier New" w:hint="default"/>
+        <w:sz w:val="20"/>
+      </w:rPr>
+    </w:lvl>
+    <w:lvl w:ilvl="2" w:tentative="1">
+      <w:start w:val="1"/>
+      <w:numFmt w:val="bullet"/>
+      <w:lvlText w:val=""/>
+      <w:lvlJc w:val="left"/>
+      <w:pPr>
+        <w:tabs>
+          <w:tab w:val="num" w:pos="2160"/>
+        </w:tabs>
+        <w:ind w:left="2160" w:hanging="360"/>
+      </w:pPr>
+      <w:rPr>
+        <w:rFonts w:ascii="Wingdings" w:hAnsi="Wingdings" w:hint="default"/>
+        <w:sz w:val="20"/>
+      </w:rPr>
+    </w:lvl>
+    <w:lvl w:ilvl="3" w:tentative="1">
+      <w:start w:val="1"/>
+      <w:numFmt w:val="bullet"/>
+      <w:lvlText w:val=""/>
+      <w:lvlJc w:val="left"/>
+      <w:pPr>
+        <w:tabs>
+          <w:tab w:val="num" w:pos="2880"/>
+        </w:tabs>
+        <w:ind w:left="2880" w:hanging="360"/>
+      </w:pPr>
+      <w:rPr>
+        <w:rFonts w:ascii="Wingdings" w:hAnsi="Wingdings" w:hint="default"/>
+        <w:sz w:val="20"/>
+      </w:rPr>
+    </w:lvl>
+    <w:lvl w:ilvl="4" w:tentative="1">
+      <w:start w:val="1"/>
+      <w:numFmt w:val="bullet"/>
+      <w:lvlText w:val=""/>
+      <w:lvlJc w:val="left"/>
+      <w:pPr>
+        <w:tabs>
+          <w:tab w:val="num" w:pos="3600"/>
+        </w:tabs>
+        <w:ind w:left="3600" w:hanging="360"/>
+      </w:pPr>
+      <w:rPr>
+        <w:rFonts w:ascii="Wingdings" w:hAnsi="Wingdings" w:hint="default"/>
+        <w:sz w:val="20"/>
+      </w:rPr>
+    </w:lvl>
+    <w:lvl w:ilvl="5" w:tentative="1">
+      <w:start w:val="1"/>
+      <w:numFmt w:val="bullet"/>
+      <w:lvlText w:val=""/>
+      <w:lvlJc w:val="left"/>
+      <w:pPr>
+        <w:tabs>
+          <w:tab w:val="num" w:pos="4320"/>
+        </w:tabs>
+        <w:ind w:left="4320" w:hanging="360"/>
+      </w:pPr>
+      <w:rPr>
+        <w:rFonts w:ascii="Wingdings" w:hAnsi="Wingdings" w:hint="default"/>
+        <w:sz w:val="20"/>
+      </w:rPr>
+    </w:lvl>
+    <w:lvl w:ilvl="6" w:tentative="1">
+      <w:start w:val="1"/>
+      <w:numFmt w:val="bullet"/>
+      <w:lvlText w:val=""/>
+      <w:lvlJc w:val="left"/>
+      <w:pPr>
+        <w:tabs>
+          <w:tab w:val="num" w:pos="5040"/>
+        </w:tabs>
+        <w:ind w:left="5040" w:hanging="360"/>
+      </w:pPr>
+      <w:rPr>
+        <w:rFonts w:ascii="Wingdings" w:hAnsi="Wingdings" w:hint="default"/>
+        <w:sz w:val="20"/>
+      </w:rPr>
+    </w:lvl>
+    <w:lvl w:ilvl="7" w:tentative="1">
+      <w:start w:val="1"/>
+      <w:numFmt w:val="bullet"/>
+      <w:lvlText w:val=""/>
+      <w:lvlJc w:val="left"/>
+      <w:pPr>
+        <w:tabs>
+          <w:tab w:val="num" w:pos="5760"/>
+        </w:tabs>
+        <w:ind w:left="5760" w:hanging="360"/>
+      </w:pPr>
+      <w:rPr>
+        <w:rFonts w:ascii="Wingdings" w:hAnsi="Wingdings" w:hint="default"/>
+        <w:sz w:val="20"/>
+      </w:rPr>
+    </w:lvl>
+    <w:lvl w:ilvl="8" w:tentative="1">
+      <w:start w:val="1"/>
+      <w:numFmt w:val="bullet"/>
+      <w:lvlText w:val=""/>
+      <w:lvlJc w:val="left"/>
+      <w:pPr>
+        <w:tabs>
+          <w:tab w:val="num" w:pos="6480"/>
+        </w:tabs>
+        <w:ind w:left="6480" w:hanging="360"/>
+      </w:pPr>
+      <w:rPr>
+        <w:rFonts w:ascii="Wingdings" w:hAnsi="Wingdings" w:hint="default"/>
+        <w:sz w:val="20"/>
+      </w:rPr>
+    </w:lvl>
+  </w:abstractNum>
+  <w:abstractNum w:abstractNumId="10" w15:restartNumberingAfterBreak="0">
     <w:nsid w:val="52FD05DA"/>
     <w:multiLevelType w:val="multilevel"/>
     <w:tmpl w:val="52ECB2C4"/>
@@ -4124,7 +6907,156 @@
       </w:pPr>
     </w:lvl>
   </w:abstractNum>
-  <w:abstractNum w:abstractNumId="7" w15:restartNumberingAfterBreak="0">
+  <w:abstractNum w:abstractNumId="11" w15:restartNumberingAfterBreak="0">
+    <w:nsid w:val="53441BE0"/>
+    <w:multiLevelType w:val="multilevel"/>
+    <w:tmpl w:val="2BB41AEA"/>
+    <w:lvl w:ilvl="0">
+      <w:start w:val="1"/>
+      <w:numFmt w:val="bullet"/>
+      <w:lvlText w:val=""/>
+      <w:lvlJc w:val="left"/>
+      <w:pPr>
+        <w:tabs>
+          <w:tab w:val="num" w:pos="720"/>
+        </w:tabs>
+        <w:ind w:left="720" w:hanging="360"/>
+      </w:pPr>
+      <w:rPr>
+        <w:rFonts w:ascii="Symbol" w:hAnsi="Symbol" w:hint="default"/>
+        <w:sz w:val="20"/>
+      </w:rPr>
+    </w:lvl>
+    <w:lvl w:ilvl="1" w:tentative="1">
+      <w:start w:val="1"/>
+      <w:numFmt w:val="bullet"/>
+      <w:lvlText w:val="o"/>
+      <w:lvlJc w:val="left"/>
+      <w:pPr>
+        <w:tabs>
+          <w:tab w:val="num" w:pos="1440"/>
+        </w:tabs>
+        <w:ind w:left="1440" w:hanging="360"/>
+      </w:pPr>
+      <w:rPr>
+        <w:rFonts w:ascii="Courier New" w:hAnsi="Courier New" w:hint="default"/>
+        <w:sz w:val="20"/>
+      </w:rPr>
+    </w:lvl>
+    <w:lvl w:ilvl="2" w:tentative="1">
+      <w:start w:val="1"/>
+      <w:numFmt w:val="bullet"/>
+      <w:lvlText w:val=""/>
+      <w:lvlJc w:val="left"/>
+      <w:pPr>
+        <w:tabs>
+          <w:tab w:val="num" w:pos="2160"/>
+        </w:tabs>
+        <w:ind w:left="2160" w:hanging="360"/>
+      </w:pPr>
+      <w:rPr>
+        <w:rFonts w:ascii="Wingdings" w:hAnsi="Wingdings" w:hint="default"/>
+        <w:sz w:val="20"/>
+      </w:rPr>
+    </w:lvl>
+    <w:lvl w:ilvl="3" w:tentative="1">
+      <w:start w:val="1"/>
+      <w:numFmt w:val="bullet"/>
+      <w:lvlText w:val=""/>
+      <w:lvlJc w:val="left"/>
+      <w:pPr>
+        <w:tabs>
+          <w:tab w:val="num" w:pos="2880"/>
+        </w:tabs>
+        <w:ind w:left="2880" w:hanging="360"/>
+      </w:pPr>
+      <w:rPr>
+        <w:rFonts w:ascii="Wingdings" w:hAnsi="Wingdings" w:hint="default"/>
+        <w:sz w:val="20"/>
+      </w:rPr>
+    </w:lvl>
+    <w:lvl w:ilvl="4" w:tentative="1">
+      <w:start w:val="1"/>
+      <w:numFmt w:val="bullet"/>
+      <w:lvlText w:val=""/>
+      <w:lvlJc w:val="left"/>
+      <w:pPr>
+        <w:tabs>
+          <w:tab w:val="num" w:pos="3600"/>
+        </w:tabs>
+        <w:ind w:left="3600" w:hanging="360"/>
+      </w:pPr>
+      <w:rPr>
+        <w:rFonts w:ascii="Wingdings" w:hAnsi="Wingdings" w:hint="default"/>
+        <w:sz w:val="20"/>
+      </w:rPr>
+    </w:lvl>
+    <w:lvl w:ilvl="5" w:tentative="1">
+      <w:start w:val="1"/>
+      <w:numFmt w:val="bullet"/>
+      <w:lvlText w:val=""/>
+      <w:lvlJc w:val="left"/>
+      <w:pPr>
+        <w:tabs>
+          <w:tab w:val="num" w:pos="4320"/>
+        </w:tabs>
+        <w:ind w:left="4320" w:hanging="360"/>
+      </w:pPr>
+      <w:rPr>
+        <w:rFonts w:ascii="Wingdings" w:hAnsi="Wingdings" w:hint="default"/>
+        <w:sz w:val="20"/>
+      </w:rPr>
+    </w:lvl>
+    <w:lvl w:ilvl="6" w:tentative="1">
+      <w:start w:val="1"/>
+      <w:numFmt w:val="bullet"/>
+      <w:lvlText w:val=""/>
+      <w:lvlJc w:val="left"/>
+      <w:pPr>
+        <w:tabs>
+          <w:tab w:val="num" w:pos="5040"/>
+        </w:tabs>
+        <w:ind w:left="5040" w:hanging="360"/>
+      </w:pPr>
+      <w:rPr>
+        <w:rFonts w:ascii="Wingdings" w:hAnsi="Wingdings" w:hint="default"/>
+        <w:sz w:val="20"/>
+      </w:rPr>
+    </w:lvl>
+    <w:lvl w:ilvl="7" w:tentative="1">
+      <w:start w:val="1"/>
+      <w:numFmt w:val="bullet"/>
+      <w:lvlText w:val=""/>
+      <w:lvlJc w:val="left"/>
+      <w:pPr>
+        <w:tabs>
+          <w:tab w:val="num" w:pos="5760"/>
+        </w:tabs>
+        <w:ind w:left="5760" w:hanging="360"/>
+      </w:pPr>
+      <w:rPr>
+        <w:rFonts w:ascii="Wingdings" w:hAnsi="Wingdings" w:hint="default"/>
+        <w:sz w:val="20"/>
+      </w:rPr>
+    </w:lvl>
+    <w:lvl w:ilvl="8" w:tentative="1">
+      <w:start w:val="1"/>
+      <w:numFmt w:val="bullet"/>
+      <w:lvlText w:val=""/>
+      <w:lvlJc w:val="left"/>
+      <w:pPr>
+        <w:tabs>
+          <w:tab w:val="num" w:pos="6480"/>
+        </w:tabs>
+        <w:ind w:left="6480" w:hanging="360"/>
+      </w:pPr>
+      <w:rPr>
+        <w:rFonts w:ascii="Wingdings" w:hAnsi="Wingdings" w:hint="default"/>
+        <w:sz w:val="20"/>
+      </w:rPr>
+    </w:lvl>
+  </w:abstractNum>
+  <w:abstractNum w:abstractNumId="12" w15:restartNumberingAfterBreak="0">
     <w:nsid w:val="63CE28F7"/>
     <w:multiLevelType w:val="multilevel"/>
     <w:tmpl w:val="860A901E"/>
@@ -4241,7 +7173,7 @@
       </w:pPr>
     </w:lvl>
   </w:abstractNum>
-  <w:abstractNum w:abstractNumId="8" w15:restartNumberingAfterBreak="0">
+  <w:abstractNum w:abstractNumId="13" w15:restartNumberingAfterBreak="0">
     <w:nsid w:val="67336A8C"/>
     <w:multiLevelType w:val="multilevel"/>
     <w:tmpl w:val="810C36A2"/>
@@ -4354,7 +7286,305 @@
       </w:pPr>
     </w:lvl>
   </w:abstractNum>
-  <w:abstractNum w:abstractNumId="9" w15:restartNumberingAfterBreak="0">
+  <w:abstractNum w:abstractNumId="14" w15:restartNumberingAfterBreak="0">
+    <w:nsid w:val="765F65D6"/>
+    <w:multiLevelType w:val="multilevel"/>
+    <w:tmpl w:val="0D783AF6"/>
+    <w:lvl w:ilvl="0">
+      <w:start w:val="1"/>
+      <w:numFmt w:val="bullet"/>
+      <w:lvlText w:val=""/>
+      <w:lvlJc w:val="left"/>
+      <w:pPr>
+        <w:tabs>
+          <w:tab w:val="num" w:pos="720"/>
+        </w:tabs>
+        <w:ind w:left="720" w:hanging="360"/>
+      </w:pPr>
+      <w:rPr>
+        <w:rFonts w:ascii="Symbol" w:hAnsi="Symbol" w:hint="default"/>
+        <w:sz w:val="20"/>
+      </w:rPr>
+    </w:lvl>
+    <w:lvl w:ilvl="1" w:tentative="1">
+      <w:start w:val="1"/>
+      <w:numFmt w:val="bullet"/>
+      <w:lvlText w:val="o"/>
+      <w:lvlJc w:val="left"/>
+      <w:pPr>
+        <w:tabs>
+          <w:tab w:val="num" w:pos="1440"/>
+        </w:tabs>
+        <w:ind w:left="1440" w:hanging="360"/>
+      </w:pPr>
+      <w:rPr>
+        <w:rFonts w:ascii="Courier New" w:hAnsi="Courier New" w:hint="default"/>
+        <w:sz w:val="20"/>
+      </w:rPr>
+    </w:lvl>
+    <w:lvl w:ilvl="2" w:tentative="1">
+      <w:start w:val="1"/>
+      <w:numFmt w:val="bullet"/>
+      <w:lvlText w:val=""/>
+      <w:lvlJc w:val="left"/>
+      <w:pPr>
+        <w:tabs>
+          <w:tab w:val="num" w:pos="2160"/>
+        </w:tabs>
+        <w:ind w:left="2160" w:hanging="360"/>
+      </w:pPr>
+      <w:rPr>
+        <w:rFonts w:ascii="Wingdings" w:hAnsi="Wingdings" w:hint="default"/>
+        <w:sz w:val="20"/>
+      </w:rPr>
+    </w:lvl>
+    <w:lvl w:ilvl="3" w:tentative="1">
+      <w:start w:val="1"/>
+      <w:numFmt w:val="bullet"/>
+      <w:lvlText w:val=""/>
+      <w:lvlJc w:val="left"/>
+      <w:pPr>
+        <w:tabs>
+          <w:tab w:val="num" w:pos="2880"/>
+        </w:tabs>
+        <w:ind w:left="2880" w:hanging="360"/>
+      </w:pPr>
+      <w:rPr>
+        <w:rFonts w:ascii="Wingdings" w:hAnsi="Wingdings" w:hint="default"/>
+        <w:sz w:val="20"/>
+      </w:rPr>
+    </w:lvl>
+    <w:lvl w:ilvl="4" w:tentative="1">
+      <w:start w:val="1"/>
+      <w:numFmt w:val="bullet"/>
+      <w:lvlText w:val=""/>
+      <w:lvlJc w:val="left"/>
+      <w:pPr>
+        <w:tabs>
+          <w:tab w:val="num" w:pos="3600"/>
+        </w:tabs>
+        <w:ind w:left="3600" w:hanging="360"/>
+      </w:pPr>
+      <w:rPr>
+        <w:rFonts w:ascii="Wingdings" w:hAnsi="Wingdings" w:hint="default"/>
+        <w:sz w:val="20"/>
+      </w:rPr>
+    </w:lvl>
+    <w:lvl w:ilvl="5" w:tentative="1">
+      <w:start w:val="1"/>
+      <w:numFmt w:val="bullet"/>
+      <w:lvlText w:val=""/>
+      <w:lvlJc w:val="left"/>
+      <w:pPr>
+        <w:tabs>
+          <w:tab w:val="num" w:pos="4320"/>
+        </w:tabs>
+        <w:ind w:left="4320" w:hanging="360"/>
+      </w:pPr>
+      <w:rPr>
+        <w:rFonts w:ascii="Wingdings" w:hAnsi="Wingdings" w:hint="default"/>
+        <w:sz w:val="20"/>
+      </w:rPr>
+    </w:lvl>
+    <w:lvl w:ilvl="6" w:tentative="1">
+      <w:start w:val="1"/>
+      <w:numFmt w:val="bullet"/>
+      <w:lvlText w:val=""/>
+      <w:lvlJc w:val="left"/>
+      <w:pPr>
+        <w:tabs>
+          <w:tab w:val="num" w:pos="5040"/>
+        </w:tabs>
+        <w:ind w:left="5040" w:hanging="360"/>
+      </w:pPr>
+      <w:rPr>
+        <w:rFonts w:ascii="Wingdings" w:hAnsi="Wingdings" w:hint="default"/>
+        <w:sz w:val="20"/>
+      </w:rPr>
+    </w:lvl>
+    <w:lvl w:ilvl="7" w:tentative="1">
+      <w:start w:val="1"/>
+      <w:numFmt w:val="bullet"/>
+      <w:lvlText w:val=""/>
+      <w:lvlJc w:val="left"/>
+      <w:pPr>
+        <w:tabs>
+          <w:tab w:val="num" w:pos="5760"/>
+        </w:tabs>
+        <w:ind w:left="5760" w:hanging="360"/>
+      </w:pPr>
+      <w:rPr>
+        <w:rFonts w:ascii="Wingdings" w:hAnsi="Wingdings" w:hint="default"/>
+        <w:sz w:val="20"/>
+      </w:rPr>
+    </w:lvl>
+    <w:lvl w:ilvl="8" w:tentative="1">
+      <w:start w:val="1"/>
+      <w:numFmt w:val="bullet"/>
+      <w:lvlText w:val=""/>
+      <w:lvlJc w:val="left"/>
+      <w:pPr>
+        <w:tabs>
+          <w:tab w:val="num" w:pos="6480"/>
+        </w:tabs>
+        <w:ind w:left="6480" w:hanging="360"/>
+      </w:pPr>
+      <w:rPr>
+        <w:rFonts w:ascii="Wingdings" w:hAnsi="Wingdings" w:hint="default"/>
+        <w:sz w:val="20"/>
+      </w:rPr>
+    </w:lvl>
+  </w:abstractNum>
+  <w:abstractNum w:abstractNumId="15" w15:restartNumberingAfterBreak="0">
+    <w:nsid w:val="76740635"/>
+    <w:multiLevelType w:val="multilevel"/>
+    <w:tmpl w:val="885A8E86"/>
+    <w:lvl w:ilvl="0">
+      <w:start w:val="1"/>
+      <w:numFmt w:val="bullet"/>
+      <w:lvlText w:val=""/>
+      <w:lvlJc w:val="left"/>
+      <w:pPr>
+        <w:tabs>
+          <w:tab w:val="num" w:pos="720"/>
+        </w:tabs>
+        <w:ind w:left="720" w:hanging="360"/>
+      </w:pPr>
+      <w:rPr>
+        <w:rFonts w:ascii="Symbol" w:hAnsi="Symbol" w:hint="default"/>
+        <w:sz w:val="20"/>
+      </w:rPr>
+    </w:lvl>
+    <w:lvl w:ilvl="1" w:tentative="1">
+      <w:start w:val="1"/>
+      <w:numFmt w:val="bullet"/>
+      <w:lvlText w:val="o"/>
+      <w:lvlJc w:val="left"/>
+      <w:pPr>
+        <w:tabs>
+          <w:tab w:val="num" w:pos="1440"/>
+        </w:tabs>
+        <w:ind w:left="1440" w:hanging="360"/>
+      </w:pPr>
+      <w:rPr>
+        <w:rFonts w:ascii="Courier New" w:hAnsi="Courier New" w:hint="default"/>
+        <w:sz w:val="20"/>
+      </w:rPr>
+    </w:lvl>
+    <w:lvl w:ilvl="2" w:tentative="1">
+      <w:start w:val="1"/>
+      <w:numFmt w:val="bullet"/>
+      <w:lvlText w:val=""/>
+      <w:lvlJc w:val="left"/>
+      <w:pPr>
+        <w:tabs>
+          <w:tab w:val="num" w:pos="2160"/>
+        </w:tabs>
+        <w:ind w:left="2160" w:hanging="360"/>
+      </w:pPr>
+      <w:rPr>
+        <w:rFonts w:ascii="Wingdings" w:hAnsi="Wingdings" w:hint="default"/>
+        <w:sz w:val="20"/>
+      </w:rPr>
+    </w:lvl>
+    <w:lvl w:ilvl="3" w:tentative="1">
+      <w:start w:val="1"/>
+      <w:numFmt w:val="bullet"/>
+      <w:lvlText w:val=""/>
+      <w:lvlJc w:val="left"/>
+      <w:pPr>
+        <w:tabs>
+          <w:tab w:val="num" w:pos="2880"/>
+        </w:tabs>
+        <w:ind w:left="2880" w:hanging="360"/>
+      </w:pPr>
+      <w:rPr>
+        <w:rFonts w:ascii="Wingdings" w:hAnsi="Wingdings" w:hint="default"/>
+        <w:sz w:val="20"/>
+      </w:rPr>
+    </w:lvl>
+    <w:lvl w:ilvl="4" w:tentative="1">
+      <w:start w:val="1"/>
+      <w:numFmt w:val="bullet"/>
+      <w:lvlText w:val=""/>
+      <w:lvlJc w:val="left"/>
+      <w:pPr>
+        <w:tabs>
+          <w:tab w:val="num" w:pos="3600"/>
+        </w:tabs>
+        <w:ind w:left="3600" w:hanging="360"/>
+      </w:pPr>
+      <w:rPr>
+        <w:rFonts w:ascii="Wingdings" w:hAnsi="Wingdings" w:hint="default"/>
+        <w:sz w:val="20"/>
+      </w:rPr>
+    </w:lvl>
+    <w:lvl w:ilvl="5" w:tentative="1">
+      <w:start w:val="1"/>
+      <w:numFmt w:val="bullet"/>
+      <w:lvlText w:val=""/>
+      <w:lvlJc w:val="left"/>
+      <w:pPr>
+        <w:tabs>
+          <w:tab w:val="num" w:pos="4320"/>
+        </w:tabs>
+        <w:ind w:left="4320" w:hanging="360"/>
+      </w:pPr>
+      <w:rPr>
+        <w:rFonts w:ascii="Wingdings" w:hAnsi="Wingdings" w:hint="default"/>
+        <w:sz w:val="20"/>
+      </w:rPr>
+    </w:lvl>
+    <w:lvl w:ilvl="6" w:tentative="1">
+      <w:start w:val="1"/>
+      <w:numFmt w:val="bullet"/>
+      <w:lvlText w:val=""/>
+      <w:lvlJc w:val="left"/>
+      <w:pPr>
+        <w:tabs>
+          <w:tab w:val="num" w:pos="5040"/>
+        </w:tabs>
+        <w:ind w:left="5040" w:hanging="360"/>
+      </w:pPr>
+      <w:rPr>
+        <w:rFonts w:ascii="Wingdings" w:hAnsi="Wingdings" w:hint="default"/>
+        <w:sz w:val="20"/>
+      </w:rPr>
+    </w:lvl>
+    <w:lvl w:ilvl="7" w:tentative="1">
+      <w:start w:val="1"/>
+      <w:numFmt w:val="bullet"/>
+      <w:lvlText w:val=""/>
+      <w:lvlJc w:val="left"/>
+      <w:pPr>
+        <w:tabs>
+          <w:tab w:val="num" w:pos="5760"/>
+        </w:tabs>
+        <w:ind w:left="5760" w:hanging="360"/>
+      </w:pPr>
+      <w:rPr>
+        <w:rFonts w:ascii="Wingdings" w:hAnsi="Wingdings" w:hint="default"/>
+        <w:sz w:val="20"/>
+      </w:rPr>
+    </w:lvl>
+    <w:lvl w:ilvl="8" w:tentative="1">
+      <w:start w:val="1"/>
+      <w:numFmt w:val="bullet"/>
+      <w:lvlText w:val=""/>
+      <w:lvlJc w:val="left"/>
+      <w:pPr>
+        <w:tabs>
+          <w:tab w:val="num" w:pos="6480"/>
+        </w:tabs>
+        <w:ind w:left="6480" w:hanging="360"/>
+      </w:pPr>
+      <w:rPr>
+        <w:rFonts w:ascii="Wingdings" w:hAnsi="Wingdings" w:hint="default"/>
+        <w:sz w:val="20"/>
+      </w:rPr>
+    </w:lvl>
+  </w:abstractNum>
+  <w:abstractNum w:abstractNumId="16" w15:restartNumberingAfterBreak="0">
     <w:nsid w:val="7A322B87"/>
     <w:multiLevelType w:val="multilevel"/>
     <w:tmpl w:val="43D8167C"/>
@@ -4503,7 +7733,7 @@
       </w:rPr>
     </w:lvl>
   </w:abstractNum>
-  <w:abstractNum w:abstractNumId="10" w15:restartNumberingAfterBreak="0">
+  <w:abstractNum w:abstractNumId="17" w15:restartNumberingAfterBreak="0">
     <w:nsid w:val="7C910AC3"/>
     <w:multiLevelType w:val="hybridMultilevel"/>
     <w:tmpl w:val="1320F404"/>
@@ -4589,7 +7819,7 @@
       </w:pPr>
     </w:lvl>
   </w:abstractNum>
-  <w:abstractNum w:abstractNumId="11" w15:restartNumberingAfterBreak="0">
+  <w:abstractNum w:abstractNumId="18" w15:restartNumberingAfterBreak="0">
     <w:nsid w:val="7CA515A9"/>
     <w:multiLevelType w:val="hybridMultilevel"/>
     <w:tmpl w:val="559EF744"/>
@@ -4676,40 +7906,61 @@
     </w:lvl>
   </w:abstractNum>
   <w:num w:numId="1" w16cid:durableId="1288857864">
-    <w:abstractNumId w:val="5"/>
+    <w:abstractNumId w:val="6"/>
   </w:num>
   <w:num w:numId="2" w16cid:durableId="232131429">
-    <w:abstractNumId w:val="3"/>
+    <w:abstractNumId w:val="4"/>
   </w:num>
   <w:num w:numId="3" w16cid:durableId="1181703710">
-    <w:abstractNumId w:val="6"/>
+    <w:abstractNumId w:val="10"/>
   </w:num>
   <w:num w:numId="4" w16cid:durableId="453670653">
-    <w:abstractNumId w:val="8"/>
+    <w:abstractNumId w:val="13"/>
   </w:num>
   <w:num w:numId="5" w16cid:durableId="919555905">
     <w:abstractNumId w:val="1"/>
   </w:num>
   <w:num w:numId="6" w16cid:durableId="1473787797">
-    <w:abstractNumId w:val="11"/>
+    <w:abstractNumId w:val="18"/>
   </w:num>
   <w:num w:numId="7" w16cid:durableId="791366683">
-    <w:abstractNumId w:val="10"/>
+    <w:abstractNumId w:val="17"/>
   </w:num>
   <w:num w:numId="8" w16cid:durableId="1854951371">
     <w:abstractNumId w:val="2"/>
   </w:num>
   <w:num w:numId="9" w16cid:durableId="778331567">
-    <w:abstractNumId w:val="7"/>
+    <w:abstractNumId w:val="12"/>
   </w:num>
   <w:num w:numId="10" w16cid:durableId="1057364652">
     <w:abstractNumId w:val="0"/>
   </w:num>
   <w:num w:numId="11" w16cid:durableId="1928801574">
+    <w:abstractNumId w:val="16"/>
+  </w:num>
+  <w:num w:numId="12" w16cid:durableId="438767774">
+    <w:abstractNumId w:val="5"/>
+  </w:num>
+  <w:num w:numId="13" w16cid:durableId="265427955">
     <w:abstractNumId w:val="9"/>
   </w:num>
-  <w:num w:numId="12" w16cid:durableId="438767774">
-    <w:abstractNumId w:val="4"/>
+  <w:num w:numId="14" w16cid:durableId="329723498">
+    <w:abstractNumId w:val="15"/>
+  </w:num>
+  <w:num w:numId="15" w16cid:durableId="1472822864">
+    <w:abstractNumId w:val="8"/>
+  </w:num>
+  <w:num w:numId="16" w16cid:durableId="1866210287">
+    <w:abstractNumId w:val="3"/>
+  </w:num>
+  <w:num w:numId="17" w16cid:durableId="972755545">
+    <w:abstractNumId w:val="7"/>
+  </w:num>
+  <w:num w:numId="18" w16cid:durableId="2058162529">
+    <w:abstractNumId w:val="11"/>
+  </w:num>
+  <w:num w:numId="19" w16cid:durableId="732780148">
+    <w:abstractNumId w:val="14"/>
   </w:num>
 </w:numbering>
 </file>

</xml_diff>